<commit_message>
Added some changes to lab2
</commit_message>
<xml_diff>
--- a/ШІ-31_Шевченко_Данііл_lab2.docx
+++ b/ШІ-31_Шевченко_Данііл_lab2.docx
@@ -1,6 +1,6 @@
 
 <file path=word/document.xml><?xml version="1.0" encoding="utf-8"?>
-<w:document xmlns:wpc="http://schemas.microsoft.com/office/word/2010/wordprocessingCanvas" xmlns:cx="http://schemas.microsoft.com/office/drawing/2014/chartex" xmlns:mc="http://schemas.openxmlformats.org/markup-compatibility/2006" xmlns:o="urn:schemas-microsoft-com:office:office" xmlns:r="http://schemas.openxmlformats.org/officeDocument/2006/relationships" xmlns:m="http://schemas.openxmlformats.org/officeDocument/2006/math" xmlns:v="urn:schemas-microsoft-com:vml" xmlns:wp14="http://schemas.microsoft.com/office/word/2010/wordprocessingDrawing" xmlns:wp="http://schemas.openxmlformats.org/drawingml/2006/wordprocessingDrawing" xmlns:w10="urn:schemas-microsoft-com:office:word" xmlns:w="http://schemas.openxmlformats.org/wordprocessingml/2006/main" xmlns:w14="http://schemas.microsoft.com/office/word/2010/wordml" xmlns:w15="http://schemas.microsoft.com/office/word/2012/wordml" xmlns:w16se="http://schemas.microsoft.com/office/word/2015/wordml/symex" xmlns:wpg="http://schemas.microsoft.com/office/word/2010/wordprocessingGroup" xmlns:wpi="http://schemas.microsoft.com/office/word/2010/wordprocessingInk" xmlns:wne="http://schemas.microsoft.com/office/word/2006/wordml" xmlns:wps="http://schemas.microsoft.com/office/word/2010/wordprocessingShape" mc:Ignorable="w14 w15 w16se wp14">
+<w:document xmlns:wpc="http://schemas.microsoft.com/office/word/2010/wordprocessingCanvas" xmlns:cx="http://schemas.microsoft.com/office/drawing/2014/chartex" xmlns:cx1="http://schemas.microsoft.com/office/drawing/2015/9/8/chartex" xmlns:cx2="http://schemas.microsoft.com/office/drawing/2015/10/21/chartex" xmlns:cx3="http://schemas.microsoft.com/office/drawing/2016/5/9/chartex" xmlns:cx4="http://schemas.microsoft.com/office/drawing/2016/5/10/chartex" xmlns:cx5="http://schemas.microsoft.com/office/drawing/2016/5/11/chartex" xmlns:cx6="http://schemas.microsoft.com/office/drawing/2016/5/12/chartex" xmlns:cx7="http://schemas.microsoft.com/office/drawing/2016/5/13/chartex" xmlns:cx8="http://schemas.microsoft.com/office/drawing/2016/5/14/chartex" xmlns:mc="http://schemas.openxmlformats.org/markup-compatibility/2006" xmlns:aink="http://schemas.microsoft.com/office/drawing/2016/ink" xmlns:am3d="http://schemas.microsoft.com/office/drawing/2017/model3d" xmlns:o="urn:schemas-microsoft-com:office:office" xmlns:oel="http://schemas.microsoft.com/office/2019/extlst" xmlns:r="http://schemas.openxmlformats.org/officeDocument/2006/relationships" xmlns:m="http://schemas.openxmlformats.org/officeDocument/2006/math" xmlns:v="urn:schemas-microsoft-com:vml" xmlns:wp14="http://schemas.microsoft.com/office/word/2010/wordprocessingDrawing" xmlns:wp="http://schemas.openxmlformats.org/drawingml/2006/wordprocessingDrawing" xmlns:w10="urn:schemas-microsoft-com:office:word" xmlns:w="http://schemas.openxmlformats.org/wordprocessingml/2006/main" xmlns:w14="http://schemas.microsoft.com/office/word/2010/wordml" xmlns:w15="http://schemas.microsoft.com/office/word/2012/wordml" xmlns:w16cex="http://schemas.microsoft.com/office/word/2018/wordml/cex" xmlns:w16cid="http://schemas.microsoft.com/office/word/2016/wordml/cid" xmlns:w16="http://schemas.microsoft.com/office/word/2018/wordml" xmlns:w16du="http://schemas.microsoft.com/office/word/2023/wordml/word16du" xmlns:w16sdtdh="http://schemas.microsoft.com/office/word/2020/wordml/sdtdatahash" xmlns:w16sdtfl="http://schemas.microsoft.com/office/word/2024/wordml/sdtformatlock" xmlns:w16se="http://schemas.microsoft.com/office/word/2015/wordml/symex" xmlns:wpg="http://schemas.microsoft.com/office/word/2010/wordprocessingGroup" xmlns:wpi="http://schemas.microsoft.com/office/word/2010/wordprocessingInk" xmlns:wne="http://schemas.microsoft.com/office/word/2006/wordml" xmlns:wps="http://schemas.microsoft.com/office/word/2010/wordprocessingShape" mc:Ignorable="w14 w15 w16se w16cid w16 w16cex w16sdtdh w16sdtfl w16du wp14">
   <w:body>
     <w:p>
       <w:pPr>
@@ -713,7 +713,23 @@
           <w:sz w:val="28"/>
           <w:szCs w:val="28"/>
         </w:rPr>
-        <w:t>Для перевірки збігів необхідно написати власну функцію матчінгу, а результати її роботи перевірити засобами OpenCV. Якщо повної реалізації дескриптора не має в OpenCV, то такий необхідно створити власну функцію 35 побудови цих дескрипторів. У цьому випадку матчінг можна здійснювати стандартними засобами (якщо це можливо).</w:t>
+        <w:t xml:space="preserve">Для перевірки збігів необхідно написати власну функцію матчінгу, а результати її роботи перевірити засобами OpenCV. Якщо повної реалізації дескриптора не має в OpenCV, то такий необхідно створити власну функцію </w:t>
+      </w:r>
+      <w:r>
+        <w:rPr>
+          <w:rFonts w:ascii="Times New Roman" w:hAnsi="Times New Roman" w:cs="Times New Roman"/>
+          <w:sz w:val="28"/>
+          <w:szCs w:val="28"/>
+        </w:rPr>
+        <w:t>з</w:t>
+      </w:r>
+      <w:r>
+        <w:rPr>
+          <w:rFonts w:ascii="Times New Roman" w:hAnsi="Times New Roman" w:cs="Times New Roman"/>
+          <w:sz w:val="28"/>
+          <w:szCs w:val="28"/>
+        </w:rPr>
+        <w:t xml:space="preserve"> побудови цих дескрипторів. У цьому випадку матчінг можна здійснювати стандартними засобами (якщо це можливо).</w:t>
       </w:r>
     </w:p>
     <w:p>
@@ -3500,7 +3516,7 @@
           <w:lang w:eastAsia="uk-UA"/>
         </w:rPr>
         <w:drawing>
-          <wp:inline distT="0" distB="0" distL="0" distR="0" wp14:anchorId="11A636BD" wp14:editId="4AB7197A">
+          <wp:inline distT="0" distB="0" distL="0" distR="0" wp14:anchorId="67267217" wp14:editId="48F3CABA">
             <wp:extent cx="4420217" cy="619211"/>
             <wp:effectExtent l="0" t="0" r="0" b="9525"/>
             <wp:docPr id="16" name="Рисунок 16"/>
@@ -3553,7 +3569,7 @@
           <w:lang w:eastAsia="uk-UA"/>
         </w:rPr>
         <w:drawing>
-          <wp:inline distT="0" distB="0" distL="0" distR="0" wp14:anchorId="0CC556E3" wp14:editId="36865E83">
+          <wp:inline distT="0" distB="0" distL="0" distR="0" wp14:anchorId="4BB50A66" wp14:editId="7B5CDA2C">
             <wp:extent cx="6120765" cy="1283970"/>
             <wp:effectExtent l="0" t="0" r="0" b="0"/>
             <wp:docPr id="1" name="Рисунок 1"/>
@@ -3623,7 +3639,7 @@
           <w:lang w:eastAsia="uk-UA"/>
         </w:rPr>
         <w:drawing>
-          <wp:inline distT="0" distB="0" distL="0" distR="0" wp14:anchorId="5FAACE04" wp14:editId="414FBFCF">
+          <wp:inline distT="0" distB="0" distL="0" distR="0" wp14:anchorId="342AB223" wp14:editId="6500AEC5">
             <wp:extent cx="6106377" cy="1076475"/>
             <wp:effectExtent l="0" t="0" r="8890" b="9525"/>
             <wp:docPr id="19" name="Рисунок 19"/>
@@ -3693,7 +3709,7 @@
           <w:lang w:eastAsia="uk-UA"/>
         </w:rPr>
         <w:drawing>
-          <wp:inline distT="0" distB="0" distL="0" distR="0" wp14:anchorId="3CF1DEA9" wp14:editId="7D5CBD69">
+          <wp:inline distT="0" distB="0" distL="0" distR="0" wp14:anchorId="663DB566" wp14:editId="6864F13B">
             <wp:extent cx="6120765" cy="880110"/>
             <wp:effectExtent l="0" t="0" r="0" b="0"/>
             <wp:docPr id="23" name="Рисунок 23"/>
@@ -3781,7 +3797,7 @@
         </w:rPr>
         <w:lastRenderedPageBreak/>
         <w:drawing>
-          <wp:inline distT="0" distB="0" distL="0" distR="0" wp14:anchorId="489C2EA5" wp14:editId="2C95A236">
+          <wp:inline distT="0" distB="0" distL="0" distR="0" wp14:anchorId="038742D9" wp14:editId="771C2D36">
             <wp:extent cx="5163271" cy="647790"/>
             <wp:effectExtent l="0" t="0" r="0" b="0"/>
             <wp:docPr id="24" name="Рисунок 24"/>
@@ -4100,7 +4116,7 @@
           <w:lang w:eastAsia="uk-UA"/>
         </w:rPr>
         <w:drawing>
-          <wp:inline distT="0" distB="0" distL="0" distR="0" wp14:anchorId="6F54B64C" wp14:editId="3BCF909F">
+          <wp:inline distT="0" distB="0" distL="0" distR="0" wp14:anchorId="0EFF5B2B" wp14:editId="75593F7C">
             <wp:extent cx="6120765" cy="974090"/>
             <wp:effectExtent l="0" t="0" r="0" b="0"/>
             <wp:docPr id="25" name="Рисунок 25"/>
@@ -4150,7 +4166,7 @@
           <w:sz w:val="28"/>
           <w:szCs w:val="28"/>
         </w:rPr>
-        <w:t>Далі безпосередньо застосовується це перетворення, при чому за принципами зворотнього відображення.</w:t>
+        <w:t>Далі безпосередньо застосовується це перетворення, при чому за принципами зворотного відображення.</w:t>
       </w:r>
     </w:p>
     <w:p>
@@ -4170,7 +4186,7 @@
           <w:lang w:eastAsia="uk-UA"/>
         </w:rPr>
         <w:drawing>
-          <wp:inline distT="0" distB="0" distL="0" distR="0" wp14:anchorId="3833F915" wp14:editId="011422B9">
+          <wp:inline distT="0" distB="0" distL="0" distR="0" wp14:anchorId="7BE56118" wp14:editId="29CAC909">
             <wp:extent cx="2572109" cy="1114581"/>
             <wp:effectExtent l="0" t="0" r="0" b="9525"/>
             <wp:docPr id="26" name="Рисунок 26"/>
@@ -4405,7 +4421,7 @@
           <w:lang w:eastAsia="uk-UA"/>
         </w:rPr>
         <w:drawing>
-          <wp:inline distT="0" distB="0" distL="0" distR="0" wp14:anchorId="228B8013" wp14:editId="25E4723D">
+          <wp:inline distT="0" distB="0" distL="0" distR="0" wp14:anchorId="638F26B9" wp14:editId="05CD79DA">
             <wp:extent cx="4791744" cy="638264"/>
             <wp:effectExtent l="0" t="0" r="8890" b="9525"/>
             <wp:docPr id="27" name="Рисунок 27"/>
@@ -4593,6 +4609,452 @@
           <w:sz w:val="28"/>
           <w:szCs w:val="28"/>
         </w:rPr>
+        <w:t xml:space="preserve">Варто зазначити, що в даному варіанті функції і формул, я розглядав лише випадок з коефіцієнтом масштабування 1.0, оскільки так вимагалось за вимогами методички, оскільки сказано перевірити інваріантність до кутів повороту та зміщень, а не розмірності. Сам по собі дескриптор </w:t>
+      </w:r>
+      <w:r>
+        <w:rPr>
+          <w:rFonts w:ascii="Times New Roman" w:hAnsi="Times New Roman" w:cs="Times New Roman"/>
+          <w:sz w:val="28"/>
+          <w:szCs w:val="28"/>
+          <w:lang w:val="en-US"/>
+        </w:rPr>
+        <w:t>BRIEF</w:t>
+      </w:r>
+      <w:r>
+        <w:rPr>
+          <w:rFonts w:ascii="Times New Roman" w:hAnsi="Times New Roman" w:cs="Times New Roman"/>
+          <w:sz w:val="28"/>
+          <w:szCs w:val="28"/>
+          <w:lang w:val="ru-RU"/>
+        </w:rPr>
+        <w:t xml:space="preserve"> </w:t>
+      </w:r>
+      <w:r>
+        <w:rPr>
+          <w:rFonts w:ascii="Times New Roman" w:hAnsi="Times New Roman" w:cs="Times New Roman"/>
+          <w:sz w:val="28"/>
+          <w:szCs w:val="28"/>
+        </w:rPr>
+        <w:t>не є інваріантним до змінення розміру і в разі масштабування картинки сильно деградує в можливостях створення інваріантних дескрипторів.</w:t>
+      </w:r>
+      <w:r>
+        <w:rPr>
+          <w:rFonts w:ascii="Times New Roman" w:hAnsi="Times New Roman" w:cs="Times New Roman"/>
+          <w:sz w:val="28"/>
+          <w:szCs w:val="28"/>
+          <w:lang w:val="ru-RU"/>
+        </w:rPr>
+        <w:t xml:space="preserve"> </w:t>
+      </w:r>
+    </w:p>
+    <w:p>
+      <w:pPr>
+        <w:rPr>
+          <w:rFonts w:ascii="Times New Roman" w:hAnsi="Times New Roman" w:cs="Times New Roman"/>
+          <w:sz w:val="28"/>
+          <w:szCs w:val="28"/>
+        </w:rPr>
+      </w:pPr>
+      <w:r>
+        <w:rPr>
+          <w:rFonts w:ascii="Times New Roman" w:hAnsi="Times New Roman" w:cs="Times New Roman"/>
+          <w:sz w:val="28"/>
+          <w:szCs w:val="28"/>
+        </w:rPr>
+        <w:lastRenderedPageBreak/>
+        <w:t>В разі, якби ми використовували також коефіцієнт масштабування, ми би отримали наступні варіації перетворення.</w:t>
+      </w:r>
+    </w:p>
+    <w:p>
+      <w:pPr>
+        <w:rPr>
+          <w:rFonts w:ascii="Times New Roman" w:hAnsi="Times New Roman" w:cs="Times New Roman"/>
+          <w:sz w:val="28"/>
+          <w:szCs w:val="28"/>
+        </w:rPr>
+      </w:pPr>
+      <w:r>
+        <w:rPr>
+          <w:rFonts w:ascii="Times New Roman" w:hAnsi="Times New Roman" w:cs="Times New Roman"/>
+          <w:sz w:val="28"/>
+          <w:szCs w:val="28"/>
+        </w:rPr>
+        <w:drawing>
+          <wp:inline distT="0" distB="0" distL="0" distR="0" wp14:anchorId="6C157453" wp14:editId="0E1C89CB">
+            <wp:extent cx="2105319" cy="314369"/>
+            <wp:effectExtent l="0" t="0" r="0" b="9525"/>
+            <wp:docPr id="1312769284" name="Picture 1"/>
+            <wp:cNvGraphicFramePr>
+              <a:graphicFrameLocks xmlns:a="http://schemas.openxmlformats.org/drawingml/2006/main" noChangeAspect="1"/>
+            </wp:cNvGraphicFramePr>
+            <a:graphic xmlns:a="http://schemas.openxmlformats.org/drawingml/2006/main">
+              <a:graphicData uri="http://schemas.openxmlformats.org/drawingml/2006/picture">
+                <pic:pic xmlns:pic="http://schemas.openxmlformats.org/drawingml/2006/picture">
+                  <pic:nvPicPr>
+                    <pic:cNvPr id="1312769284" name=""/>
+                    <pic:cNvPicPr/>
+                  </pic:nvPicPr>
+                  <pic:blipFill>
+                    <a:blip r:embed="rId13"/>
+                    <a:stretch>
+                      <a:fillRect/>
+                    </a:stretch>
+                  </pic:blipFill>
+                  <pic:spPr>
+                    <a:xfrm>
+                      <a:off x="0" y="0"/>
+                      <a:ext cx="2105319" cy="314369"/>
+                    </a:xfrm>
+                    <a:prstGeom prst="rect">
+                      <a:avLst/>
+                    </a:prstGeom>
+                  </pic:spPr>
+                </pic:pic>
+              </a:graphicData>
+            </a:graphic>
+          </wp:inline>
+        </w:drawing>
+      </w:r>
+    </w:p>
+    <w:p>
+      <w:pPr>
+        <w:rPr>
+          <w:rFonts w:ascii="Times New Roman" w:hAnsi="Times New Roman" w:cs="Times New Roman"/>
+          <w:sz w:val="28"/>
+          <w:szCs w:val="28"/>
+        </w:rPr>
+      </w:pPr>
+      <w:r>
+        <w:rPr>
+          <w:rFonts w:ascii="Times New Roman" w:hAnsi="Times New Roman" w:cs="Times New Roman"/>
+          <w:sz w:val="28"/>
+          <w:szCs w:val="28"/>
+        </w:rPr>
+        <w:drawing>
+          <wp:inline distT="0" distB="0" distL="0" distR="0" wp14:anchorId="117B3D65" wp14:editId="3FEEF8CC">
+            <wp:extent cx="4124901" cy="476316"/>
+            <wp:effectExtent l="0" t="0" r="9525" b="0"/>
+            <wp:docPr id="269728133" name="Picture 1"/>
+            <wp:cNvGraphicFramePr>
+              <a:graphicFrameLocks xmlns:a="http://schemas.openxmlformats.org/drawingml/2006/main" noChangeAspect="1"/>
+            </wp:cNvGraphicFramePr>
+            <a:graphic xmlns:a="http://schemas.openxmlformats.org/drawingml/2006/main">
+              <a:graphicData uri="http://schemas.openxmlformats.org/drawingml/2006/picture">
+                <pic:pic xmlns:pic="http://schemas.openxmlformats.org/drawingml/2006/picture">
+                  <pic:nvPicPr>
+                    <pic:cNvPr id="269728133" name=""/>
+                    <pic:cNvPicPr/>
+                  </pic:nvPicPr>
+                  <pic:blipFill>
+                    <a:blip r:embed="rId14"/>
+                    <a:stretch>
+                      <a:fillRect/>
+                    </a:stretch>
+                  </pic:blipFill>
+                  <pic:spPr>
+                    <a:xfrm>
+                      <a:off x="0" y="0"/>
+                      <a:ext cx="4124901" cy="476316"/>
+                    </a:xfrm>
+                    <a:prstGeom prst="rect">
+                      <a:avLst/>
+                    </a:prstGeom>
+                  </pic:spPr>
+                </pic:pic>
+              </a:graphicData>
+            </a:graphic>
+          </wp:inline>
+        </w:drawing>
+      </w:r>
+    </w:p>
+    <w:p>
+      <w:pPr>
+        <w:rPr>
+          <w:rFonts w:ascii="Times New Roman" w:hAnsi="Times New Roman" w:cs="Times New Roman"/>
+          <w:sz w:val="28"/>
+          <w:szCs w:val="28"/>
+        </w:rPr>
+      </w:pPr>
+      <w:r>
+        <w:rPr>
+          <w:rFonts w:ascii="Times New Roman" w:hAnsi="Times New Roman" w:cs="Times New Roman"/>
+          <w:sz w:val="28"/>
+          <w:szCs w:val="28"/>
+        </w:rPr>
+        <w:drawing>
+          <wp:inline distT="0" distB="0" distL="0" distR="0" wp14:anchorId="4257F599" wp14:editId="29064688">
+            <wp:extent cx="6120765" cy="1183005"/>
+            <wp:effectExtent l="0" t="0" r="0" b="0"/>
+            <wp:docPr id="1511544647" name="Picture 1"/>
+            <wp:cNvGraphicFramePr>
+              <a:graphicFrameLocks xmlns:a="http://schemas.openxmlformats.org/drawingml/2006/main" noChangeAspect="1"/>
+            </wp:cNvGraphicFramePr>
+            <a:graphic xmlns:a="http://schemas.openxmlformats.org/drawingml/2006/main">
+              <a:graphicData uri="http://schemas.openxmlformats.org/drawingml/2006/picture">
+                <pic:pic xmlns:pic="http://schemas.openxmlformats.org/drawingml/2006/picture">
+                  <pic:nvPicPr>
+                    <pic:cNvPr id="1511544647" name=""/>
+                    <pic:cNvPicPr/>
+                  </pic:nvPicPr>
+                  <pic:blipFill>
+                    <a:blip r:embed="rId15"/>
+                    <a:stretch>
+                      <a:fillRect/>
+                    </a:stretch>
+                  </pic:blipFill>
+                  <pic:spPr>
+                    <a:xfrm>
+                      <a:off x="0" y="0"/>
+                      <a:ext cx="6120765" cy="1183005"/>
+                    </a:xfrm>
+                    <a:prstGeom prst="rect">
+                      <a:avLst/>
+                    </a:prstGeom>
+                  </pic:spPr>
+                </pic:pic>
+              </a:graphicData>
+            </a:graphic>
+          </wp:inline>
+        </w:drawing>
+      </w:r>
+    </w:p>
+    <w:p>
+      <w:pPr>
+        <w:rPr>
+          <w:rFonts w:ascii="Times New Roman" w:hAnsi="Times New Roman" w:cs="Times New Roman"/>
+          <w:sz w:val="28"/>
+          <w:szCs w:val="28"/>
+        </w:rPr>
+      </w:pPr>
+      <w:r>
+        <w:rPr>
+          <w:rFonts w:ascii="Times New Roman" w:hAnsi="Times New Roman" w:cs="Times New Roman"/>
+          <w:sz w:val="28"/>
+          <w:szCs w:val="28"/>
+        </w:rPr>
+        <w:drawing>
+          <wp:inline distT="0" distB="0" distL="0" distR="0" wp14:anchorId="3AC3C620" wp14:editId="7FE5C9B5">
+            <wp:extent cx="6120765" cy="1047115"/>
+            <wp:effectExtent l="0" t="0" r="0" b="635"/>
+            <wp:docPr id="79786818" name="Picture 1"/>
+            <wp:cNvGraphicFramePr>
+              <a:graphicFrameLocks xmlns:a="http://schemas.openxmlformats.org/drawingml/2006/main" noChangeAspect="1"/>
+            </wp:cNvGraphicFramePr>
+            <a:graphic xmlns:a="http://schemas.openxmlformats.org/drawingml/2006/main">
+              <a:graphicData uri="http://schemas.openxmlformats.org/drawingml/2006/picture">
+                <pic:pic xmlns:pic="http://schemas.openxmlformats.org/drawingml/2006/picture">
+                  <pic:nvPicPr>
+                    <pic:cNvPr id="79786818" name=""/>
+                    <pic:cNvPicPr/>
+                  </pic:nvPicPr>
+                  <pic:blipFill>
+                    <a:blip r:embed="rId16"/>
+                    <a:stretch>
+                      <a:fillRect/>
+                    </a:stretch>
+                  </pic:blipFill>
+                  <pic:spPr>
+                    <a:xfrm>
+                      <a:off x="0" y="0"/>
+                      <a:ext cx="6120765" cy="1047115"/>
+                    </a:xfrm>
+                    <a:prstGeom prst="rect">
+                      <a:avLst/>
+                    </a:prstGeom>
+                  </pic:spPr>
+                </pic:pic>
+              </a:graphicData>
+            </a:graphic>
+          </wp:inline>
+        </w:drawing>
+      </w:r>
+    </w:p>
+    <w:p>
+      <w:pPr>
+        <w:rPr>
+          <w:rFonts w:ascii="Times New Roman" w:hAnsi="Times New Roman" w:cs="Times New Roman"/>
+          <w:sz w:val="28"/>
+          <w:szCs w:val="28"/>
+        </w:rPr>
+      </w:pPr>
+      <w:r>
+        <w:rPr>
+          <w:rFonts w:ascii="Times New Roman" w:hAnsi="Times New Roman" w:cs="Times New Roman"/>
+          <w:sz w:val="28"/>
+          <w:szCs w:val="28"/>
+        </w:rPr>
+        <w:drawing>
+          <wp:inline distT="0" distB="0" distL="0" distR="0" wp14:anchorId="40BCAD65" wp14:editId="2154CD84">
+            <wp:extent cx="5839640" cy="2896004"/>
+            <wp:effectExtent l="0" t="0" r="8890" b="0"/>
+            <wp:docPr id="44184466" name="Picture 1"/>
+            <wp:cNvGraphicFramePr>
+              <a:graphicFrameLocks xmlns:a="http://schemas.openxmlformats.org/drawingml/2006/main" noChangeAspect="1"/>
+            </wp:cNvGraphicFramePr>
+            <a:graphic xmlns:a="http://schemas.openxmlformats.org/drawingml/2006/main">
+              <a:graphicData uri="http://schemas.openxmlformats.org/drawingml/2006/picture">
+                <pic:pic xmlns:pic="http://schemas.openxmlformats.org/drawingml/2006/picture">
+                  <pic:nvPicPr>
+                    <pic:cNvPr id="44184466" name=""/>
+                    <pic:cNvPicPr/>
+                  </pic:nvPicPr>
+                  <pic:blipFill>
+                    <a:blip r:embed="rId17"/>
+                    <a:stretch>
+                      <a:fillRect/>
+                    </a:stretch>
+                  </pic:blipFill>
+                  <pic:spPr>
+                    <a:xfrm>
+                      <a:off x="0" y="0"/>
+                      <a:ext cx="5839640" cy="2896004"/>
+                    </a:xfrm>
+                    <a:prstGeom prst="rect">
+                      <a:avLst/>
+                    </a:prstGeom>
+                  </pic:spPr>
+                </pic:pic>
+              </a:graphicData>
+            </a:graphic>
+          </wp:inline>
+        </w:drawing>
+      </w:r>
+    </w:p>
+    <w:p>
+      <w:pPr>
+        <w:rPr>
+          <w:rFonts w:ascii="Times New Roman" w:hAnsi="Times New Roman" w:cs="Times New Roman"/>
+          <w:sz w:val="28"/>
+          <w:szCs w:val="28"/>
+        </w:rPr>
+      </w:pPr>
+    </w:p>
+    <w:p>
+      <w:pPr>
+        <w:rPr>
+          <w:rFonts w:ascii="Times New Roman" w:hAnsi="Times New Roman" w:cs="Times New Roman"/>
+          <w:sz w:val="28"/>
+          <w:szCs w:val="28"/>
+        </w:rPr>
+      </w:pPr>
+      <w:r>
+        <w:rPr>
+          <w:rFonts w:ascii="Times New Roman" w:hAnsi="Times New Roman" w:cs="Times New Roman"/>
+          <w:sz w:val="28"/>
+          <w:szCs w:val="28"/>
+        </w:rPr>
+        <w:drawing>
+          <wp:inline distT="0" distB="0" distL="0" distR="0" wp14:anchorId="5E54DEB5" wp14:editId="78F0B4A5">
+            <wp:extent cx="5763429" cy="800212"/>
+            <wp:effectExtent l="0" t="0" r="0" b="0"/>
+            <wp:docPr id="567039014" name="Picture 1"/>
+            <wp:cNvGraphicFramePr>
+              <a:graphicFrameLocks xmlns:a="http://schemas.openxmlformats.org/drawingml/2006/main" noChangeAspect="1"/>
+            </wp:cNvGraphicFramePr>
+            <a:graphic xmlns:a="http://schemas.openxmlformats.org/drawingml/2006/main">
+              <a:graphicData uri="http://schemas.openxmlformats.org/drawingml/2006/picture">
+                <pic:pic xmlns:pic="http://schemas.openxmlformats.org/drawingml/2006/picture">
+                  <pic:nvPicPr>
+                    <pic:cNvPr id="567039014" name=""/>
+                    <pic:cNvPicPr/>
+                  </pic:nvPicPr>
+                  <pic:blipFill>
+                    <a:blip r:embed="rId18"/>
+                    <a:stretch>
+                      <a:fillRect/>
+                    </a:stretch>
+                  </pic:blipFill>
+                  <pic:spPr>
+                    <a:xfrm>
+                      <a:off x="0" y="0"/>
+                      <a:ext cx="5763429" cy="800212"/>
+                    </a:xfrm>
+                    <a:prstGeom prst="rect">
+                      <a:avLst/>
+                    </a:prstGeom>
+                  </pic:spPr>
+                </pic:pic>
+              </a:graphicData>
+            </a:graphic>
+          </wp:inline>
+        </w:drawing>
+      </w:r>
+    </w:p>
+    <w:p>
+      <w:pPr>
+        <w:rPr>
+          <w:rFonts w:ascii="Times New Roman" w:hAnsi="Times New Roman" w:cs="Times New Roman"/>
+          <w:sz w:val="28"/>
+          <w:szCs w:val="28"/>
+        </w:rPr>
+      </w:pPr>
+      <w:r>
+        <w:rPr>
+          <w:rFonts w:ascii="Times New Roman" w:hAnsi="Times New Roman" w:cs="Times New Roman"/>
+          <w:sz w:val="28"/>
+          <w:szCs w:val="28"/>
+        </w:rPr>
+        <w:drawing>
+          <wp:inline distT="0" distB="0" distL="0" distR="0" wp14:anchorId="61F5BB1A" wp14:editId="1958F34F">
+            <wp:extent cx="6120765" cy="669925"/>
+            <wp:effectExtent l="0" t="0" r="0" b="0"/>
+            <wp:docPr id="1513505544" name="Picture 1"/>
+            <wp:cNvGraphicFramePr>
+              <a:graphicFrameLocks xmlns:a="http://schemas.openxmlformats.org/drawingml/2006/main" noChangeAspect="1"/>
+            </wp:cNvGraphicFramePr>
+            <a:graphic xmlns:a="http://schemas.openxmlformats.org/drawingml/2006/main">
+              <a:graphicData uri="http://schemas.openxmlformats.org/drawingml/2006/picture">
+                <pic:pic xmlns:pic="http://schemas.openxmlformats.org/drawingml/2006/picture">
+                  <pic:nvPicPr>
+                    <pic:cNvPr id="1513505544" name=""/>
+                    <pic:cNvPicPr/>
+                  </pic:nvPicPr>
+                  <pic:blipFill>
+                    <a:blip r:embed="rId19"/>
+                    <a:stretch>
+                      <a:fillRect/>
+                    </a:stretch>
+                  </pic:blipFill>
+                  <pic:spPr>
+                    <a:xfrm>
+                      <a:off x="0" y="0"/>
+                      <a:ext cx="6120765" cy="669925"/>
+                    </a:xfrm>
+                    <a:prstGeom prst="rect">
+                      <a:avLst/>
+                    </a:prstGeom>
+                  </pic:spPr>
+                </pic:pic>
+              </a:graphicData>
+            </a:graphic>
+          </wp:inline>
+        </w:drawing>
+      </w:r>
+    </w:p>
+    <w:p>
+      <w:pPr>
+        <w:rPr>
+          <w:rFonts w:ascii="Times New Roman" w:hAnsi="Times New Roman" w:cs="Times New Roman"/>
+          <w:sz w:val="28"/>
+          <w:szCs w:val="28"/>
+        </w:rPr>
+      </w:pPr>
+    </w:p>
+    <w:p>
+      <w:pPr>
+        <w:rPr>
+          <w:rFonts w:ascii="Times New Roman" w:hAnsi="Times New Roman" w:cs="Times New Roman"/>
+          <w:sz w:val="28"/>
+          <w:szCs w:val="28"/>
+        </w:rPr>
+      </w:pPr>
+      <w:r>
+        <w:rPr>
+          <w:rFonts w:ascii="Times New Roman" w:hAnsi="Times New Roman" w:cs="Times New Roman"/>
+          <w:sz w:val="28"/>
+          <w:szCs w:val="28"/>
+        </w:rPr>
+        <w:lastRenderedPageBreak/>
         <w:t>Далі ми прописуємо функцію, яка знаходить особливі точки та відповіді дескриптори.</w:t>
       </w:r>
     </w:p>
@@ -4897,16 +5359,6 @@
           <w:lang w:eastAsia="uk-UA"/>
         </w:rPr>
         <w:br/>
-      </w:r>
-      <w:r>
-        <w:rPr>
-          <w:rFonts w:ascii="Courier New" w:eastAsia="Times New Roman" w:hAnsi="Courier New" w:cs="Courier New"/>
-          <w:color w:val="A9B7C6"/>
-          <w:sz w:val="20"/>
-          <w:szCs w:val="20"/>
-          <w:lang w:eastAsia="uk-UA"/>
-        </w:rPr>
-        <w:lastRenderedPageBreak/>
         <w:t xml:space="preserve">    keypoints = detector.detect(img</w:t>
       </w:r>
       <w:r>
@@ -5159,7 +5611,7 @@
           <w:lang w:eastAsia="uk-UA"/>
         </w:rPr>
         <w:drawing>
-          <wp:inline distT="0" distB="0" distL="0" distR="0" wp14:anchorId="690FD539" wp14:editId="19788BDC">
+          <wp:inline distT="0" distB="0" distL="0" distR="0" wp14:anchorId="36C8503A" wp14:editId="3DBA851B">
             <wp:extent cx="2448267" cy="2048161"/>
             <wp:effectExtent l="0" t="0" r="9525" b="9525"/>
             <wp:docPr id="2" name="Рисунок 2"/>
@@ -5174,7 +5626,7 @@
                     <pic:cNvPicPr/>
                   </pic:nvPicPr>
                   <pic:blipFill>
-                    <a:blip r:embed="rId13"/>
+                    <a:blip r:embed="rId20"/>
                     <a:stretch>
                       <a:fillRect/>
                     </a:stretch>
@@ -5335,7 +5787,7 @@
           <w:lang w:eastAsia="uk-UA"/>
         </w:rPr>
         <w:drawing>
-          <wp:inline distT="0" distB="0" distL="0" distR="0" wp14:anchorId="557F8897" wp14:editId="7A68E713">
+          <wp:inline distT="0" distB="0" distL="0" distR="0" wp14:anchorId="379133F3" wp14:editId="5882D4A2">
             <wp:extent cx="1390844" cy="552527"/>
             <wp:effectExtent l="0" t="0" r="0" b="0"/>
             <wp:docPr id="3" name="Рисунок 3"/>
@@ -5350,7 +5802,7 @@
                     <pic:cNvPicPr/>
                   </pic:nvPicPr>
                   <pic:blipFill>
-                    <a:blip r:embed="rId14"/>
+                    <a:blip r:embed="rId21"/>
                     <a:stretch>
                       <a:fillRect/>
                     </a:stretch>
@@ -5431,7 +5883,7 @@
           <w:lang w:eastAsia="uk-UA"/>
         </w:rPr>
         <w:drawing>
-          <wp:inline distT="0" distB="0" distL="0" distR="0" wp14:anchorId="72FC2A59" wp14:editId="23508A25">
+          <wp:inline distT="0" distB="0" distL="0" distR="0" wp14:anchorId="2E241F26" wp14:editId="3ACBB58B">
             <wp:extent cx="1771897" cy="666843"/>
             <wp:effectExtent l="0" t="0" r="0" b="0"/>
             <wp:docPr id="4" name="Рисунок 4"/>
@@ -5446,7 +5898,7 @@
                     <pic:cNvPicPr/>
                   </pic:nvPicPr>
                   <pic:blipFill>
-                    <a:blip r:embed="rId15"/>
+                    <a:blip r:embed="rId22"/>
                     <a:stretch>
                       <a:fillRect/>
                     </a:stretch>
@@ -5506,6 +5958,7 @@
           <w:sz w:val="28"/>
           <w:szCs w:val="28"/>
         </w:rPr>
+        <w:lastRenderedPageBreak/>
         <w:t xml:space="preserve">Також використовується </w:t>
       </w:r>
       <w:r>
@@ -5584,9 +6037,8 @@
           <w:szCs w:val="28"/>
           <w:lang w:eastAsia="uk-UA"/>
         </w:rPr>
-        <w:lastRenderedPageBreak/>
         <w:drawing>
-          <wp:inline distT="0" distB="0" distL="0" distR="0" wp14:anchorId="50DCDCB5" wp14:editId="5E00D733">
+          <wp:inline distT="0" distB="0" distL="0" distR="0" wp14:anchorId="34006CF0" wp14:editId="0F600C0E">
             <wp:extent cx="5896798" cy="1362265"/>
             <wp:effectExtent l="0" t="0" r="8890" b="9525"/>
             <wp:docPr id="5" name="Рисунок 5"/>
@@ -5601,7 +6053,7 @@
                     <pic:cNvPicPr/>
                   </pic:nvPicPr>
                   <pic:blipFill>
-                    <a:blip r:embed="rId16"/>
+                    <a:blip r:embed="rId23"/>
                     <a:stretch>
                       <a:fillRect/>
                     </a:stretch>
@@ -5874,7 +6326,7 @@
           <w:lang w:eastAsia="uk-UA"/>
         </w:rPr>
         <w:drawing>
-          <wp:inline distT="0" distB="0" distL="0" distR="0" wp14:anchorId="19E55C33" wp14:editId="4CD42C51">
+          <wp:inline distT="0" distB="0" distL="0" distR="0" wp14:anchorId="72BB38E5" wp14:editId="138291CB">
             <wp:extent cx="3810532" cy="809738"/>
             <wp:effectExtent l="0" t="0" r="0" b="9525"/>
             <wp:docPr id="6" name="Рисунок 6"/>
@@ -5889,7 +6341,7 @@
                     <pic:cNvPicPr/>
                   </pic:nvPicPr>
                   <pic:blipFill>
-                    <a:blip r:embed="rId17"/>
+                    <a:blip r:embed="rId24"/>
                     <a:stretch>
                       <a:fillRect/>
                     </a:stretch>
@@ -5987,7 +6439,7 @@
           <w:lang w:eastAsia="uk-UA"/>
         </w:rPr>
         <w:drawing>
-          <wp:inline distT="0" distB="0" distL="0" distR="0" wp14:anchorId="50D157A7" wp14:editId="2CD69615">
+          <wp:inline distT="0" distB="0" distL="0" distR="0" wp14:anchorId="131FE21B" wp14:editId="4931D29E">
             <wp:extent cx="809738" cy="323895"/>
             <wp:effectExtent l="0" t="0" r="9525" b="0"/>
             <wp:docPr id="7" name="Рисунок 7"/>
@@ -6002,7 +6454,7 @@
                     <pic:cNvPicPr/>
                   </pic:nvPicPr>
                   <pic:blipFill>
-                    <a:blip r:embed="rId18"/>
+                    <a:blip r:embed="rId25"/>
                     <a:stretch>
                       <a:fillRect/>
                     </a:stretch>
@@ -6108,7 +6560,7 @@
           <w:lang w:eastAsia="uk-UA"/>
         </w:rPr>
         <w:drawing>
-          <wp:inline distT="0" distB="0" distL="0" distR="0" wp14:anchorId="50B67514" wp14:editId="4324DCD7">
+          <wp:inline distT="0" distB="0" distL="0" distR="0" wp14:anchorId="1769C2B4" wp14:editId="4F5F3BEC">
             <wp:extent cx="2524477" cy="733527"/>
             <wp:effectExtent l="0" t="0" r="9525" b="9525"/>
             <wp:docPr id="8" name="Рисунок 8"/>
@@ -6123,7 +6575,7 @@
                     <pic:cNvPicPr/>
                   </pic:nvPicPr>
                   <pic:blipFill>
-                    <a:blip r:embed="rId19"/>
+                    <a:blip r:embed="rId26"/>
                     <a:stretch>
                       <a:fillRect/>
                     </a:stretch>
@@ -6178,7 +6630,7 @@
           <w:lang w:eastAsia="uk-UA"/>
         </w:rPr>
         <w:drawing>
-          <wp:inline distT="0" distB="0" distL="0" distR="0" wp14:anchorId="3EA48809" wp14:editId="2B4E083E">
+          <wp:inline distT="0" distB="0" distL="0" distR="0" wp14:anchorId="138A9FFC" wp14:editId="48283274">
             <wp:extent cx="4420217" cy="990738"/>
             <wp:effectExtent l="0" t="0" r="0" b="0"/>
             <wp:docPr id="9" name="Рисунок 9"/>
@@ -6193,7 +6645,7 @@
                     <pic:cNvPicPr/>
                   </pic:nvPicPr>
                   <pic:blipFill>
-                    <a:blip r:embed="rId20"/>
+                    <a:blip r:embed="rId27"/>
                     <a:stretch>
                       <a:fillRect/>
                     </a:stretch>
@@ -6229,6 +6681,7 @@
           <w:szCs w:val="28"/>
           <w:lang w:val="en-US"/>
         </w:rPr>
+        <w:lastRenderedPageBreak/>
         <w:t xml:space="preserve">I - </w:t>
       </w:r>
       <w:r>
@@ -6324,7 +6777,6 @@
           <w:sz w:val="28"/>
           <w:szCs w:val="28"/>
         </w:rPr>
-        <w:lastRenderedPageBreak/>
         <w:t xml:space="preserve">Отже, отримуємо в кінці 256 чисел 0 або 1. </w:t>
       </w:r>
       <w:r>
@@ -6336,7 +6788,7 @@
           <w:lang w:eastAsia="uk-UA"/>
         </w:rPr>
         <w:drawing>
-          <wp:inline distT="0" distB="0" distL="0" distR="0" wp14:anchorId="14D5FEDB" wp14:editId="545276D7">
+          <wp:inline distT="0" distB="0" distL="0" distR="0" wp14:anchorId="492476EA" wp14:editId="16F2C2A1">
             <wp:extent cx="2067213" cy="390580"/>
             <wp:effectExtent l="0" t="0" r="0" b="9525"/>
             <wp:docPr id="10" name="Рисунок 10"/>
@@ -6351,7 +6803,7 @@
                     <pic:cNvPicPr/>
                   </pic:nvPicPr>
                   <pic:blipFill>
-                    <a:blip r:embed="rId21"/>
+                    <a:blip r:embed="rId28"/>
                     <a:stretch>
                       <a:fillRect/>
                     </a:stretch>
@@ -6406,7 +6858,7 @@
           <w:lang w:eastAsia="uk-UA"/>
         </w:rPr>
         <w:drawing>
-          <wp:inline distT="0" distB="0" distL="0" distR="0" wp14:anchorId="7921C225" wp14:editId="4B5137FA">
+          <wp:inline distT="0" distB="0" distL="0" distR="0" wp14:anchorId="7A21693C" wp14:editId="6ECF1F53">
             <wp:extent cx="3048425" cy="847843"/>
             <wp:effectExtent l="0" t="0" r="0" b="9525"/>
             <wp:docPr id="11" name="Рисунок 11"/>
@@ -6421,7 +6873,7 @@
                     <pic:cNvPicPr/>
                   </pic:nvPicPr>
                   <pic:blipFill>
-                    <a:blip r:embed="rId22"/>
+                    <a:blip r:embed="rId29"/>
                     <a:stretch>
                       <a:fillRect/>
                     </a:stretch>
@@ -6504,7 +6956,7 @@
           <w:lang w:eastAsia="uk-UA"/>
         </w:rPr>
         <w:drawing>
-          <wp:inline distT="0" distB="0" distL="0" distR="0" wp14:anchorId="09DC6CDF" wp14:editId="23E6AEC7">
+          <wp:inline distT="0" distB="0" distL="0" distR="0" wp14:anchorId="1AF1AF29" wp14:editId="44D9830C">
             <wp:extent cx="5744377" cy="1819529"/>
             <wp:effectExtent l="0" t="0" r="8890" b="9525"/>
             <wp:docPr id="12" name="Рисунок 12"/>
@@ -6519,7 +6971,7 @@
                     <pic:cNvPicPr/>
                   </pic:nvPicPr>
                   <pic:blipFill>
-                    <a:blip r:embed="rId23"/>
+                    <a:blip r:embed="rId30"/>
                     <a:stretch>
                       <a:fillRect/>
                     </a:stretch>
@@ -7943,6 +8395,16 @@
           <w:lang w:eastAsia="uk-UA"/>
         </w:rPr>
         <w:br/>
+      </w:r>
+      <w:r>
+        <w:rPr>
+          <w:rFonts w:ascii="Courier New" w:eastAsia="Times New Roman" w:hAnsi="Courier New" w:cs="Courier New"/>
+          <w:color w:val="A9B7C6"/>
+          <w:sz w:val="20"/>
+          <w:szCs w:val="20"/>
+          <w:lang w:eastAsia="uk-UA"/>
+        </w:rPr>
+        <w:lastRenderedPageBreak/>
         <w:t xml:space="preserve">    matches = []</w:t>
       </w:r>
       <w:r>
@@ -8056,16 +8518,6 @@
           <w:lang w:eastAsia="uk-UA"/>
         </w:rPr>
         <w:br/>
-      </w:r>
-      <w:r>
-        <w:rPr>
-          <w:rFonts w:ascii="Courier New" w:eastAsia="Times New Roman" w:hAnsi="Courier New" w:cs="Courier New"/>
-          <w:color w:val="A9B7C6"/>
-          <w:sz w:val="20"/>
-          <w:szCs w:val="20"/>
-          <w:lang w:eastAsia="uk-UA"/>
-        </w:rPr>
-        <w:lastRenderedPageBreak/>
         <w:t xml:space="preserve">        best_in_desc1 = np.argmin(dist_matrix</w:t>
       </w:r>
       <w:r>
@@ -9481,7 +9933,7 @@
     </w:p>
     <w:p>
       <w:pPr>
-        <w:pStyle w:val="a6"/>
+        <w:pStyle w:val="ListParagraph"/>
         <w:numPr>
           <w:ilvl w:val="0"/>
           <w:numId w:val="9"/>
@@ -10123,7 +10575,7 @@
     </w:p>
     <w:p>
       <w:pPr>
-        <w:pStyle w:val="a6"/>
+        <w:pStyle w:val="ListParagraph"/>
         <w:rPr>
           <w:rFonts w:ascii="Times New Roman" w:hAnsi="Times New Roman" w:cs="Times New Roman"/>
           <w:sz w:val="28"/>
@@ -10133,7 +10585,7 @@
     </w:p>
     <w:p>
       <w:pPr>
-        <w:pStyle w:val="a6"/>
+        <w:pStyle w:val="ListParagraph"/>
         <w:numPr>
           <w:ilvl w:val="0"/>
           <w:numId w:val="9"/>
@@ -10302,7 +10754,7 @@
     </w:p>
     <w:p>
       <w:pPr>
-        <w:pStyle w:val="HTML"/>
+        <w:pStyle w:val="HTMLPreformatted"/>
         <w:shd w:val="clear" w:color="auto" w:fill="1E1F22"/>
         <w:rPr>
           <w:color w:val="A9B7C6"/>
@@ -10522,6 +10974,7 @@
         <w:rPr>
           <w:color w:val="AA4926"/>
         </w:rPr>
+        <w:lastRenderedPageBreak/>
         <w:t>_imgIdx</w:t>
       </w:r>
       <w:r>
@@ -10597,7 +11050,6 @@
           <w:sz w:val="28"/>
           <w:szCs w:val="28"/>
         </w:rPr>
-        <w:lastRenderedPageBreak/>
         <w:t xml:space="preserve">Також прописуємо функцію, яка проводить порівняння через наш кастомний </w:t>
       </w:r>
       <w:r>
@@ -10645,7 +11097,7 @@
     </w:p>
     <w:p>
       <w:pPr>
-        <w:pStyle w:val="HTML"/>
+        <w:pStyle w:val="HTMLPreformatted"/>
         <w:shd w:val="clear" w:color="auto" w:fill="1E1F22"/>
         <w:rPr>
           <w:color w:val="A9B7C6"/>
@@ -10901,7 +11353,7 @@
     </w:p>
     <w:p>
       <w:pPr>
-        <w:pStyle w:val="HTML"/>
+        <w:pStyle w:val="HTMLPreformatted"/>
         <w:shd w:val="clear" w:color="auto" w:fill="1E1F22"/>
         <w:rPr>
           <w:color w:val="A9B7C6"/>
@@ -11388,7 +11840,7 @@
     </w:p>
     <w:p>
       <w:pPr>
-        <w:pStyle w:val="a6"/>
+        <w:pStyle w:val="ListParagraph"/>
         <w:numPr>
           <w:ilvl w:val="0"/>
           <w:numId w:val="10"/>
@@ -11432,7 +11884,7 @@
     </w:p>
     <w:p>
       <w:pPr>
-        <w:pStyle w:val="a6"/>
+        <w:pStyle w:val="ListParagraph"/>
         <w:numPr>
           <w:ilvl w:val="0"/>
           <w:numId w:val="10"/>
@@ -11457,7 +11909,7 @@
     </w:p>
     <w:p>
       <w:pPr>
-        <w:pStyle w:val="a6"/>
+        <w:pStyle w:val="ListParagraph"/>
         <w:numPr>
           <w:ilvl w:val="0"/>
           <w:numId w:val="10"/>
@@ -11501,7 +11953,7 @@
     </w:p>
     <w:p>
       <w:pPr>
-        <w:pStyle w:val="a6"/>
+        <w:pStyle w:val="ListParagraph"/>
         <w:numPr>
           <w:ilvl w:val="0"/>
           <w:numId w:val="10"/>
@@ -11526,7 +11978,7 @@
     </w:p>
     <w:p>
       <w:pPr>
-        <w:pStyle w:val="a6"/>
+        <w:pStyle w:val="ListParagraph"/>
         <w:numPr>
           <w:ilvl w:val="0"/>
           <w:numId w:val="10"/>
@@ -11614,687 +12066,12 @@
           <w:szCs w:val="28"/>
           <w:lang w:eastAsia="uk-UA"/>
         </w:rPr>
+        <w:lastRenderedPageBreak/>
         <w:drawing>
-          <wp:inline distT="0" distB="0" distL="0" distR="0" wp14:anchorId="0E04B296" wp14:editId="3CAAAE5F">
+          <wp:inline distT="0" distB="0" distL="0" distR="0" wp14:anchorId="67854451" wp14:editId="7E9AB2E9">
             <wp:extent cx="3591426" cy="924054"/>
             <wp:effectExtent l="0" t="0" r="9525" b="9525"/>
             <wp:docPr id="13" name="Рисунок 13"/>
-            <wp:cNvGraphicFramePr>
-              <a:graphicFrameLocks xmlns:a="http://schemas.openxmlformats.org/drawingml/2006/main" noChangeAspect="1"/>
-            </wp:cNvGraphicFramePr>
-            <a:graphic xmlns:a="http://schemas.openxmlformats.org/drawingml/2006/main">
-              <a:graphicData uri="http://schemas.openxmlformats.org/drawingml/2006/picture">
-                <pic:pic xmlns:pic="http://schemas.openxmlformats.org/drawingml/2006/picture">
-                  <pic:nvPicPr>
-                    <pic:cNvPr id="1" name=""/>
-                    <pic:cNvPicPr/>
-                  </pic:nvPicPr>
-                  <pic:blipFill>
-                    <a:blip r:embed="rId24"/>
-                    <a:stretch>
-                      <a:fillRect/>
-                    </a:stretch>
-                  </pic:blipFill>
-                  <pic:spPr>
-                    <a:xfrm>
-                      <a:off x="0" y="0"/>
-                      <a:ext cx="3591426" cy="924054"/>
-                    </a:xfrm>
-                    <a:prstGeom prst="rect">
-                      <a:avLst/>
-                    </a:prstGeom>
-                  </pic:spPr>
-                </pic:pic>
-              </a:graphicData>
-            </a:graphic>
-          </wp:inline>
-        </w:drawing>
-      </w:r>
-    </w:p>
-    <w:p>
-      <w:pPr>
-        <w:spacing w:before="100" w:beforeAutospacing="1" w:after="100" w:afterAutospacing="1" w:line="240" w:lineRule="auto"/>
-        <w:rPr>
-          <w:rFonts w:ascii="Times New Roman" w:eastAsia="Times New Roman" w:hAnsi="Times New Roman" w:cs="Times New Roman"/>
-          <w:sz w:val="28"/>
-          <w:szCs w:val="28"/>
-          <w:lang w:eastAsia="uk-UA"/>
-        </w:rPr>
-      </w:pPr>
-      <w:r>
-        <w:rPr>
-          <w:rFonts w:ascii="Times New Roman" w:eastAsia="Times New Roman" w:hAnsi="Times New Roman" w:cs="Times New Roman"/>
-          <w:sz w:val="28"/>
-          <w:szCs w:val="28"/>
-          <w:lang w:eastAsia="uk-UA"/>
-        </w:rPr>
-        <w:t>Кожна з 3 пар точок дає 2 лінійних рівняння.</w:t>
-      </w:r>
-    </w:p>
-    <w:p>
-      <w:pPr>
-        <w:spacing w:before="100" w:beforeAutospacing="1" w:after="100" w:afterAutospacing="1" w:line="240" w:lineRule="auto"/>
-        <w:rPr>
-          <w:rFonts w:ascii="Times New Roman" w:eastAsia="Times New Roman" w:hAnsi="Times New Roman" w:cs="Times New Roman"/>
-          <w:sz w:val="28"/>
-          <w:szCs w:val="28"/>
-          <w:lang w:eastAsia="uk-UA"/>
-        </w:rPr>
-      </w:pPr>
-      <w:r>
-        <w:rPr>
-          <w:rFonts w:ascii="Times New Roman" w:eastAsia="Times New Roman" w:hAnsi="Times New Roman" w:cs="Times New Roman"/>
-          <w:noProof/>
-          <w:sz w:val="28"/>
-          <w:szCs w:val="28"/>
-          <w:lang w:eastAsia="uk-UA"/>
-        </w:rPr>
-        <w:lastRenderedPageBreak/>
-        <w:drawing>
-          <wp:inline distT="0" distB="0" distL="0" distR="0" wp14:anchorId="12A73CE1" wp14:editId="59B1E295">
-            <wp:extent cx="3067478" cy="638264"/>
-            <wp:effectExtent l="0" t="0" r="0" b="9525"/>
-            <wp:docPr id="15" name="Рисунок 15"/>
-            <wp:cNvGraphicFramePr>
-              <a:graphicFrameLocks xmlns:a="http://schemas.openxmlformats.org/drawingml/2006/main" noChangeAspect="1"/>
-            </wp:cNvGraphicFramePr>
-            <a:graphic xmlns:a="http://schemas.openxmlformats.org/drawingml/2006/main">
-              <a:graphicData uri="http://schemas.openxmlformats.org/drawingml/2006/picture">
-                <pic:pic xmlns:pic="http://schemas.openxmlformats.org/drawingml/2006/picture">
-                  <pic:nvPicPr>
-                    <pic:cNvPr id="1" name=""/>
-                    <pic:cNvPicPr/>
-                  </pic:nvPicPr>
-                  <pic:blipFill>
-                    <a:blip r:embed="rId25"/>
-                    <a:stretch>
-                      <a:fillRect/>
-                    </a:stretch>
-                  </pic:blipFill>
-                  <pic:spPr>
-                    <a:xfrm>
-                      <a:off x="0" y="0"/>
-                      <a:ext cx="3067478" cy="638264"/>
-                    </a:xfrm>
-                    <a:prstGeom prst="rect">
-                      <a:avLst/>
-                    </a:prstGeom>
-                  </pic:spPr>
-                </pic:pic>
-              </a:graphicData>
-            </a:graphic>
-          </wp:inline>
-        </w:drawing>
-      </w:r>
-    </w:p>
-    <w:p>
-      <w:pPr>
-        <w:spacing w:before="100" w:beforeAutospacing="1" w:after="100" w:afterAutospacing="1" w:line="240" w:lineRule="auto"/>
-        <w:rPr>
-          <w:rFonts w:ascii="Times New Roman" w:eastAsia="Times New Roman" w:hAnsi="Times New Roman" w:cs="Times New Roman"/>
-          <w:sz w:val="28"/>
-          <w:szCs w:val="28"/>
-          <w:lang w:eastAsia="uk-UA"/>
-        </w:rPr>
-      </w:pPr>
-      <w:r>
-        <w:rPr>
-          <w:rFonts w:ascii="Times New Roman" w:eastAsia="Times New Roman" w:hAnsi="Times New Roman" w:cs="Times New Roman"/>
-          <w:noProof/>
-          <w:sz w:val="28"/>
-          <w:szCs w:val="28"/>
-          <w:lang w:eastAsia="uk-UA"/>
-        </w:rPr>
-        <w:drawing>
-          <wp:inline distT="0" distB="0" distL="0" distR="0" wp14:anchorId="3B2A009B" wp14:editId="6EA70D4D">
-            <wp:extent cx="3000794" cy="724001"/>
-            <wp:effectExtent l="0" t="0" r="9525" b="0"/>
-            <wp:docPr id="17" name="Рисунок 17"/>
-            <wp:cNvGraphicFramePr>
-              <a:graphicFrameLocks xmlns:a="http://schemas.openxmlformats.org/drawingml/2006/main" noChangeAspect="1"/>
-            </wp:cNvGraphicFramePr>
-            <a:graphic xmlns:a="http://schemas.openxmlformats.org/drawingml/2006/main">
-              <a:graphicData uri="http://schemas.openxmlformats.org/drawingml/2006/picture">
-                <pic:pic xmlns:pic="http://schemas.openxmlformats.org/drawingml/2006/picture">
-                  <pic:nvPicPr>
-                    <pic:cNvPr id="1" name=""/>
-                    <pic:cNvPicPr/>
-                  </pic:nvPicPr>
-                  <pic:blipFill>
-                    <a:blip r:embed="rId26"/>
-                    <a:stretch>
-                      <a:fillRect/>
-                    </a:stretch>
-                  </pic:blipFill>
-                  <pic:spPr>
-                    <a:xfrm>
-                      <a:off x="0" y="0"/>
-                      <a:ext cx="3000794" cy="724001"/>
-                    </a:xfrm>
-                    <a:prstGeom prst="rect">
-                      <a:avLst/>
-                    </a:prstGeom>
-                  </pic:spPr>
-                </pic:pic>
-              </a:graphicData>
-            </a:graphic>
-          </wp:inline>
-        </w:drawing>
-      </w:r>
-    </w:p>
-    <w:p>
-      <w:pPr>
-        <w:spacing w:before="100" w:beforeAutospacing="1" w:after="100" w:afterAutospacing="1" w:line="240" w:lineRule="auto"/>
-        <w:rPr>
-          <w:rFonts w:ascii="Times New Roman" w:eastAsia="Times New Roman" w:hAnsi="Times New Roman" w:cs="Times New Roman"/>
-          <w:sz w:val="28"/>
-          <w:szCs w:val="28"/>
-          <w:lang w:eastAsia="uk-UA"/>
-        </w:rPr>
-      </w:pPr>
-      <w:r>
-        <w:rPr>
-          <w:rFonts w:ascii="Times New Roman" w:eastAsia="Times New Roman" w:hAnsi="Times New Roman" w:cs="Times New Roman"/>
-          <w:sz w:val="28"/>
-          <w:szCs w:val="28"/>
-          <w:lang w:eastAsia="uk-UA"/>
-        </w:rPr>
-        <w:t>Всього таких рівнянь буде 6 і саме 6 змінних нам треба знайти. В матричному вигляді це наступна система</w:t>
-      </w:r>
-    </w:p>
-    <w:p>
-      <w:pPr>
-        <w:spacing w:before="100" w:beforeAutospacing="1" w:after="100" w:afterAutospacing="1" w:line="240" w:lineRule="auto"/>
-        <w:rPr>
-          <w:rFonts w:ascii="Times New Roman" w:eastAsia="Times New Roman" w:hAnsi="Times New Roman" w:cs="Times New Roman"/>
-          <w:sz w:val="28"/>
-          <w:szCs w:val="28"/>
-          <w:lang w:eastAsia="uk-UA"/>
-        </w:rPr>
-      </w:pPr>
-      <w:r>
-        <w:rPr>
-          <w:rFonts w:ascii="Times New Roman" w:eastAsia="Times New Roman" w:hAnsi="Times New Roman" w:cs="Times New Roman"/>
-          <w:noProof/>
-          <w:sz w:val="28"/>
-          <w:szCs w:val="28"/>
-          <w:lang w:eastAsia="uk-UA"/>
-        </w:rPr>
-        <w:drawing>
-          <wp:inline distT="0" distB="0" distL="0" distR="0" wp14:anchorId="5E0D2D66" wp14:editId="2264557C">
-            <wp:extent cx="4534533" cy="2010056"/>
-            <wp:effectExtent l="0" t="0" r="0" b="9525"/>
-            <wp:docPr id="18" name="Рисунок 18"/>
-            <wp:cNvGraphicFramePr>
-              <a:graphicFrameLocks xmlns:a="http://schemas.openxmlformats.org/drawingml/2006/main" noChangeAspect="1"/>
-            </wp:cNvGraphicFramePr>
-            <a:graphic xmlns:a="http://schemas.openxmlformats.org/drawingml/2006/main">
-              <a:graphicData uri="http://schemas.openxmlformats.org/drawingml/2006/picture">
-                <pic:pic xmlns:pic="http://schemas.openxmlformats.org/drawingml/2006/picture">
-                  <pic:nvPicPr>
-                    <pic:cNvPr id="1" name=""/>
-                    <pic:cNvPicPr/>
-                  </pic:nvPicPr>
-                  <pic:blipFill>
-                    <a:blip r:embed="rId27"/>
-                    <a:stretch>
-                      <a:fillRect/>
-                    </a:stretch>
-                  </pic:blipFill>
-                  <pic:spPr>
-                    <a:xfrm>
-                      <a:off x="0" y="0"/>
-                      <a:ext cx="4534533" cy="2010056"/>
-                    </a:xfrm>
-                    <a:prstGeom prst="rect">
-                      <a:avLst/>
-                    </a:prstGeom>
-                  </pic:spPr>
-                </pic:pic>
-              </a:graphicData>
-            </a:graphic>
-          </wp:inline>
-        </w:drawing>
-      </w:r>
-    </w:p>
-    <w:p>
-      <w:pPr>
-        <w:spacing w:before="100" w:beforeAutospacing="1" w:after="100" w:afterAutospacing="1" w:line="240" w:lineRule="auto"/>
-        <w:rPr>
-          <w:rFonts w:ascii="Times New Roman" w:eastAsia="Times New Roman" w:hAnsi="Times New Roman" w:cs="Times New Roman"/>
-          <w:sz w:val="28"/>
-          <w:szCs w:val="28"/>
-          <w:lang w:eastAsia="uk-UA"/>
-        </w:rPr>
-      </w:pPr>
-      <w:r>
-        <w:rPr>
-          <w:rFonts w:ascii="Times New Roman" w:eastAsia="Times New Roman" w:hAnsi="Times New Roman" w:cs="Times New Roman"/>
-          <w:sz w:val="28"/>
-          <w:szCs w:val="28"/>
-          <w:lang w:eastAsia="uk-UA"/>
-        </w:rPr>
-        <w:t xml:space="preserve">В матричній формі </w:t>
-      </w:r>
-      <w:r>
-        <w:rPr>
-          <w:rFonts w:ascii="Times New Roman" w:eastAsia="Times New Roman" w:hAnsi="Times New Roman" w:cs="Times New Roman"/>
-          <w:sz w:val="28"/>
-          <w:szCs w:val="28"/>
-          <w:lang w:val="en-US" w:eastAsia="uk-UA"/>
-        </w:rPr>
-        <w:t>A</w:t>
-      </w:r>
-      <w:r>
-        <w:rPr>
-          <w:rFonts w:ascii="Times New Roman" w:eastAsia="Times New Roman" w:hAnsi="Times New Roman" w:cs="Times New Roman"/>
-          <w:sz w:val="28"/>
-          <w:szCs w:val="28"/>
-          <w:lang w:val="ru-RU" w:eastAsia="uk-UA"/>
-        </w:rPr>
-        <w:t xml:space="preserve"> * </w:t>
-      </w:r>
-      <w:r>
-        <w:rPr>
-          <w:rFonts w:ascii="Times New Roman" w:eastAsia="Times New Roman" w:hAnsi="Times New Roman" w:cs="Times New Roman"/>
-          <w:sz w:val="28"/>
-          <w:szCs w:val="28"/>
-          <w:lang w:val="en-US" w:eastAsia="uk-UA"/>
-        </w:rPr>
-        <w:t>h</w:t>
-      </w:r>
-      <w:r>
-        <w:rPr>
-          <w:rFonts w:ascii="Times New Roman" w:eastAsia="Times New Roman" w:hAnsi="Times New Roman" w:cs="Times New Roman"/>
-          <w:sz w:val="28"/>
-          <w:szCs w:val="28"/>
-          <w:lang w:val="ru-RU" w:eastAsia="uk-UA"/>
-        </w:rPr>
-        <w:t xml:space="preserve"> = </w:t>
-      </w:r>
-      <w:r>
-        <w:rPr>
-          <w:rFonts w:ascii="Times New Roman" w:eastAsia="Times New Roman" w:hAnsi="Times New Roman" w:cs="Times New Roman"/>
-          <w:sz w:val="28"/>
-          <w:szCs w:val="28"/>
-          <w:lang w:val="en-US" w:eastAsia="uk-UA"/>
-        </w:rPr>
-        <w:t>b</w:t>
-      </w:r>
-      <w:r>
-        <w:rPr>
-          <w:rFonts w:ascii="Times New Roman" w:eastAsia="Times New Roman" w:hAnsi="Times New Roman" w:cs="Times New Roman"/>
-          <w:sz w:val="28"/>
-          <w:szCs w:val="28"/>
-          <w:lang w:eastAsia="uk-UA"/>
-        </w:rPr>
-        <w:t>, звідки</w:t>
-      </w:r>
-    </w:p>
-    <w:p>
-      <w:pPr>
-        <w:spacing w:before="100" w:beforeAutospacing="1" w:after="100" w:afterAutospacing="1" w:line="240" w:lineRule="auto"/>
-        <w:rPr>
-          <w:rFonts w:ascii="Times New Roman" w:eastAsia="Times New Roman" w:hAnsi="Times New Roman" w:cs="Times New Roman"/>
-          <w:sz w:val="28"/>
-          <w:szCs w:val="28"/>
-          <w:lang w:eastAsia="uk-UA"/>
-        </w:rPr>
-      </w:pPr>
-      <w:r>
-        <w:rPr>
-          <w:rFonts w:ascii="Times New Roman" w:eastAsia="Times New Roman" w:hAnsi="Times New Roman" w:cs="Times New Roman"/>
-          <w:noProof/>
-          <w:sz w:val="28"/>
-          <w:szCs w:val="28"/>
-          <w:lang w:eastAsia="uk-UA"/>
-        </w:rPr>
-        <w:drawing>
-          <wp:inline distT="0" distB="0" distL="0" distR="0" wp14:anchorId="71875A96" wp14:editId="726E33F1">
-            <wp:extent cx="1257475" cy="514422"/>
-            <wp:effectExtent l="0" t="0" r="0" b="0"/>
-            <wp:docPr id="20" name="Рисунок 20"/>
-            <wp:cNvGraphicFramePr>
-              <a:graphicFrameLocks xmlns:a="http://schemas.openxmlformats.org/drawingml/2006/main" noChangeAspect="1"/>
-            </wp:cNvGraphicFramePr>
-            <a:graphic xmlns:a="http://schemas.openxmlformats.org/drawingml/2006/main">
-              <a:graphicData uri="http://schemas.openxmlformats.org/drawingml/2006/picture">
-                <pic:pic xmlns:pic="http://schemas.openxmlformats.org/drawingml/2006/picture">
-                  <pic:nvPicPr>
-                    <pic:cNvPr id="1" name=""/>
-                    <pic:cNvPicPr/>
-                  </pic:nvPicPr>
-                  <pic:blipFill>
-                    <a:blip r:embed="rId28"/>
-                    <a:stretch>
-                      <a:fillRect/>
-                    </a:stretch>
-                  </pic:blipFill>
-                  <pic:spPr>
-                    <a:xfrm>
-                      <a:off x="0" y="0"/>
-                      <a:ext cx="1257475" cy="514422"/>
-                    </a:xfrm>
-                    <a:prstGeom prst="rect">
-                      <a:avLst/>
-                    </a:prstGeom>
-                  </pic:spPr>
-                </pic:pic>
-              </a:graphicData>
-            </a:graphic>
-          </wp:inline>
-        </w:drawing>
-      </w:r>
-    </w:p>
-    <w:p>
-      <w:pPr>
-        <w:spacing w:before="100" w:beforeAutospacing="1" w:after="100" w:afterAutospacing="1" w:line="240" w:lineRule="auto"/>
-        <w:rPr>
-          <w:rFonts w:ascii="Times New Roman" w:eastAsia="Times New Roman" w:hAnsi="Times New Roman" w:cs="Times New Roman"/>
-          <w:sz w:val="28"/>
-          <w:szCs w:val="28"/>
-          <w:lang w:eastAsia="uk-UA"/>
-        </w:rPr>
-      </w:pPr>
-      <w:r>
-        <w:rPr>
-          <w:rFonts w:ascii="Times New Roman" w:eastAsia="Times New Roman" w:hAnsi="Times New Roman" w:cs="Times New Roman"/>
-          <w:sz w:val="28"/>
-          <w:szCs w:val="28"/>
-          <w:lang w:eastAsia="uk-UA"/>
-        </w:rPr>
-        <w:t xml:space="preserve">Так будуються орієнтовні матриці. Обирається та матриця </w:t>
-      </w:r>
-      <w:r>
-        <w:rPr>
-          <w:rFonts w:ascii="Times New Roman" w:eastAsia="Times New Roman" w:hAnsi="Times New Roman" w:cs="Times New Roman"/>
-          <w:sz w:val="28"/>
-          <w:szCs w:val="28"/>
-          <w:lang w:val="en-US" w:eastAsia="uk-UA"/>
-        </w:rPr>
-        <w:t>M</w:t>
-      </w:r>
-      <w:r>
-        <w:rPr>
-          <w:rFonts w:ascii="Times New Roman" w:eastAsia="Times New Roman" w:hAnsi="Times New Roman" w:cs="Times New Roman"/>
-          <w:sz w:val="28"/>
-          <w:szCs w:val="28"/>
-          <w:lang w:eastAsia="uk-UA"/>
-        </w:rPr>
-        <w:t>, яка мала найбільшу кількість інлаєрів, а потім вона уточнюється.</w:t>
-      </w:r>
-    </w:p>
-    <w:p>
-      <w:pPr>
-        <w:spacing w:before="100" w:beforeAutospacing="1" w:after="100" w:afterAutospacing="1" w:line="240" w:lineRule="auto"/>
-        <w:rPr>
-          <w:rFonts w:ascii="Times New Roman" w:eastAsia="Times New Roman" w:hAnsi="Times New Roman" w:cs="Times New Roman"/>
-          <w:sz w:val="28"/>
-          <w:szCs w:val="28"/>
-          <w:lang w:eastAsia="uk-UA"/>
-        </w:rPr>
-      </w:pPr>
-      <w:r>
-        <w:rPr>
-          <w:rFonts w:ascii="Times New Roman" w:eastAsia="Times New Roman" w:hAnsi="Times New Roman" w:cs="Times New Roman"/>
-          <w:sz w:val="28"/>
-          <w:szCs w:val="28"/>
-          <w:lang w:eastAsia="uk-UA"/>
-        </w:rPr>
-        <w:t xml:space="preserve">Нехай після уточнення маємо матрицю </w:t>
-      </w:r>
-      <w:r>
-        <w:rPr>
-          <w:rFonts w:ascii="Times New Roman" w:eastAsia="Times New Roman" w:hAnsi="Times New Roman" w:cs="Times New Roman"/>
-          <w:sz w:val="28"/>
-          <w:szCs w:val="28"/>
-          <w:lang w:val="en-US" w:eastAsia="uk-UA"/>
-        </w:rPr>
-        <w:t>M</w:t>
-      </w:r>
-      <w:r>
-        <w:rPr>
-          <w:rFonts w:ascii="Times New Roman" w:eastAsia="Times New Roman" w:hAnsi="Times New Roman" w:cs="Times New Roman"/>
-          <w:sz w:val="28"/>
-          <w:szCs w:val="28"/>
-          <w:lang w:eastAsia="uk-UA"/>
-        </w:rPr>
-        <w:t xml:space="preserve"> </w:t>
-      </w:r>
-      <w:r>
-        <w:rPr>
-          <w:rFonts w:ascii="Times New Roman" w:eastAsia="Times New Roman" w:hAnsi="Times New Roman" w:cs="Times New Roman"/>
-          <w:sz w:val="28"/>
-          <w:szCs w:val="28"/>
-          <w:lang w:val="en-US" w:eastAsia="uk-UA"/>
-        </w:rPr>
-        <w:t>i</w:t>
-      </w:r>
-      <w:r>
-        <w:rPr>
-          <w:rFonts w:ascii="Times New Roman" w:eastAsia="Times New Roman" w:hAnsi="Times New Roman" w:cs="Times New Roman"/>
-          <w:sz w:val="28"/>
-          <w:szCs w:val="28"/>
-          <w:lang w:eastAsia="uk-UA"/>
-        </w:rPr>
-        <w:t xml:space="preserve"> </w:t>
-      </w:r>
-      <w:r>
-        <w:rPr>
-          <w:rFonts w:ascii="Times New Roman" w:eastAsia="Times New Roman" w:hAnsi="Times New Roman" w:cs="Times New Roman"/>
-          <w:sz w:val="28"/>
-          <w:szCs w:val="28"/>
-          <w:lang w:val="en-US" w:eastAsia="uk-UA"/>
-        </w:rPr>
-        <w:t>K</w:t>
-      </w:r>
-      <w:r>
-        <w:rPr>
-          <w:rFonts w:ascii="Times New Roman" w:eastAsia="Times New Roman" w:hAnsi="Times New Roman" w:cs="Times New Roman"/>
-          <w:sz w:val="28"/>
-          <w:szCs w:val="28"/>
-          <w:lang w:eastAsia="uk-UA"/>
-        </w:rPr>
-        <w:t xml:space="preserve"> </w:t>
-      </w:r>
-      <w:r>
-        <w:rPr>
-          <w:rFonts w:ascii="Times New Roman" w:eastAsia="Times New Roman" w:hAnsi="Times New Roman" w:cs="Times New Roman"/>
-          <w:sz w:val="28"/>
-          <w:szCs w:val="28"/>
-          <w:lang w:eastAsia="uk-UA"/>
-        </w:rPr>
-        <w:t>надійних інлаєрів.</w:t>
-      </w:r>
-    </w:p>
-    <w:p>
-      <w:pPr>
-        <w:spacing w:before="100" w:beforeAutospacing="1" w:after="100" w:afterAutospacing="1" w:line="240" w:lineRule="auto"/>
-        <w:rPr>
-          <w:rFonts w:ascii="Times New Roman" w:eastAsia="Times New Roman" w:hAnsi="Times New Roman" w:cs="Times New Roman"/>
-          <w:sz w:val="28"/>
-          <w:szCs w:val="28"/>
-          <w:lang w:eastAsia="uk-UA"/>
-        </w:rPr>
-      </w:pPr>
-      <w:r>
-        <w:rPr>
-          <w:rFonts w:ascii="Times New Roman" w:eastAsia="Times New Roman" w:hAnsi="Times New Roman" w:cs="Times New Roman"/>
-          <w:sz w:val="28"/>
-          <w:szCs w:val="28"/>
-          <w:lang w:eastAsia="uk-UA"/>
-        </w:rPr>
-        <w:t>Далі необхідно вирішити задачу оптимізації за методом найменших квадратів.</w:t>
-      </w:r>
-    </w:p>
-    <w:p>
-      <w:pPr>
-        <w:spacing w:before="100" w:beforeAutospacing="1" w:after="100" w:afterAutospacing="1" w:line="240" w:lineRule="auto"/>
-        <w:rPr>
-          <w:rFonts w:ascii="Times New Roman" w:eastAsia="Times New Roman" w:hAnsi="Times New Roman" w:cs="Times New Roman"/>
-          <w:sz w:val="28"/>
-          <w:szCs w:val="28"/>
-          <w:lang w:eastAsia="uk-UA"/>
-        </w:rPr>
-      </w:pPr>
-      <w:r>
-        <w:rPr>
-          <w:rFonts w:ascii="Times New Roman" w:eastAsia="Times New Roman" w:hAnsi="Times New Roman" w:cs="Times New Roman"/>
-          <w:noProof/>
-          <w:sz w:val="28"/>
-          <w:szCs w:val="28"/>
-          <w:lang w:eastAsia="uk-UA"/>
-        </w:rPr>
-        <w:drawing>
-          <wp:inline distT="0" distB="0" distL="0" distR="0" wp14:anchorId="0FCFB095" wp14:editId="38F16698">
-            <wp:extent cx="3200847" cy="1286054"/>
-            <wp:effectExtent l="0" t="0" r="0" b="0"/>
-            <wp:docPr id="21" name="Рисунок 21"/>
-            <wp:cNvGraphicFramePr>
-              <a:graphicFrameLocks xmlns:a="http://schemas.openxmlformats.org/drawingml/2006/main" noChangeAspect="1"/>
-            </wp:cNvGraphicFramePr>
-            <a:graphic xmlns:a="http://schemas.openxmlformats.org/drawingml/2006/main">
-              <a:graphicData uri="http://schemas.openxmlformats.org/drawingml/2006/picture">
-                <pic:pic xmlns:pic="http://schemas.openxmlformats.org/drawingml/2006/picture">
-                  <pic:nvPicPr>
-                    <pic:cNvPr id="1" name=""/>
-                    <pic:cNvPicPr/>
-                  </pic:nvPicPr>
-                  <pic:blipFill>
-                    <a:blip r:embed="rId29"/>
-                    <a:stretch>
-                      <a:fillRect/>
-                    </a:stretch>
-                  </pic:blipFill>
-                  <pic:spPr>
-                    <a:xfrm>
-                      <a:off x="0" y="0"/>
-                      <a:ext cx="3200847" cy="1286054"/>
-                    </a:xfrm>
-                    <a:prstGeom prst="rect">
-                      <a:avLst/>
-                    </a:prstGeom>
-                  </pic:spPr>
-                </pic:pic>
-              </a:graphicData>
-            </a:graphic>
-          </wp:inline>
-        </w:drawing>
-      </w:r>
-    </w:p>
-    <w:p>
-      <w:pPr>
-        <w:spacing w:before="100" w:beforeAutospacing="1" w:after="100" w:afterAutospacing="1" w:line="240" w:lineRule="auto"/>
-        <w:rPr>
-          <w:rFonts w:ascii="Times New Roman" w:eastAsia="Times New Roman" w:hAnsi="Times New Roman" w:cs="Times New Roman"/>
-          <w:sz w:val="28"/>
-          <w:szCs w:val="28"/>
-          <w:lang w:eastAsia="uk-UA"/>
-        </w:rPr>
-      </w:pPr>
-      <w:r>
-        <w:rPr>
-          <w:rFonts w:ascii="Times New Roman" w:eastAsia="Times New Roman" w:hAnsi="Times New Roman" w:cs="Times New Roman"/>
-          <w:sz w:val="28"/>
-          <w:szCs w:val="28"/>
-          <w:lang w:eastAsia="uk-UA"/>
-        </w:rPr>
-        <w:lastRenderedPageBreak/>
-        <w:t xml:space="preserve">Тут </w:t>
-      </w:r>
-      <w:r>
-        <w:rPr>
-          <w:rFonts w:ascii="Times New Roman" w:eastAsia="Times New Roman" w:hAnsi="Times New Roman" w:cs="Times New Roman"/>
-          <w:noProof/>
-          <w:sz w:val="28"/>
-          <w:szCs w:val="28"/>
-          <w:lang w:eastAsia="uk-UA"/>
-        </w:rPr>
-        <w:drawing>
-          <wp:inline distT="0" distB="0" distL="0" distR="0" wp14:anchorId="5034CC38" wp14:editId="42F558E4">
-            <wp:extent cx="971686" cy="1066949"/>
-            <wp:effectExtent l="0" t="0" r="0" b="0"/>
-            <wp:docPr id="22" name="Рисунок 22"/>
-            <wp:cNvGraphicFramePr>
-              <a:graphicFrameLocks xmlns:a="http://schemas.openxmlformats.org/drawingml/2006/main" noChangeAspect="1"/>
-            </wp:cNvGraphicFramePr>
-            <a:graphic xmlns:a="http://schemas.openxmlformats.org/drawingml/2006/main">
-              <a:graphicData uri="http://schemas.openxmlformats.org/drawingml/2006/picture">
-                <pic:pic xmlns:pic="http://schemas.openxmlformats.org/drawingml/2006/picture">
-                  <pic:nvPicPr>
-                    <pic:cNvPr id="1" name=""/>
-                    <pic:cNvPicPr/>
-                  </pic:nvPicPr>
-                  <pic:blipFill>
-                    <a:blip r:embed="rId30"/>
-                    <a:stretch>
-                      <a:fillRect/>
-                    </a:stretch>
-                  </pic:blipFill>
-                  <pic:spPr>
-                    <a:xfrm>
-                      <a:off x="0" y="0"/>
-                      <a:ext cx="971686" cy="1066949"/>
-                    </a:xfrm>
-                    <a:prstGeom prst="rect">
-                      <a:avLst/>
-                    </a:prstGeom>
-                  </pic:spPr>
-                </pic:pic>
-              </a:graphicData>
-            </a:graphic>
-          </wp:inline>
-        </w:drawing>
-      </w:r>
-      <w:r>
-        <w:rPr>
-          <w:rFonts w:ascii="Times New Roman" w:eastAsia="Times New Roman" w:hAnsi="Times New Roman" w:cs="Times New Roman"/>
-          <w:sz w:val="28"/>
-          <w:szCs w:val="28"/>
-          <w:lang w:eastAsia="uk-UA"/>
-        </w:rPr>
-        <w:t xml:space="preserve"> - це точка, куди має перенестись </w:t>
-      </w:r>
-      <w:r>
-        <w:rPr>
-          <w:rFonts w:ascii="Times New Roman" w:eastAsia="Times New Roman" w:hAnsi="Times New Roman" w:cs="Times New Roman"/>
-          <w:sz w:val="28"/>
-          <w:szCs w:val="28"/>
-          <w:lang w:val="en-US" w:eastAsia="uk-UA"/>
-        </w:rPr>
-        <w:t>i</w:t>
-      </w:r>
-      <w:r>
-        <w:rPr>
-          <w:rFonts w:ascii="Times New Roman" w:eastAsia="Times New Roman" w:hAnsi="Times New Roman" w:cs="Times New Roman"/>
-          <w:sz w:val="28"/>
-          <w:szCs w:val="28"/>
-          <w:lang w:val="ru-RU" w:eastAsia="uk-UA"/>
-        </w:rPr>
-        <w:t>-</w:t>
-      </w:r>
-      <w:r>
-        <w:rPr>
-          <w:rFonts w:ascii="Times New Roman" w:eastAsia="Times New Roman" w:hAnsi="Times New Roman" w:cs="Times New Roman"/>
-          <w:sz w:val="28"/>
-          <w:szCs w:val="28"/>
-          <w:lang w:eastAsia="uk-UA"/>
-        </w:rPr>
-        <w:t xml:space="preserve">а вхідна точка згідно з нашою моделлю. </w:t>
-      </w:r>
-      <w:r>
-        <w:rPr>
-          <w:rFonts w:ascii="Times New Roman" w:eastAsia="Times New Roman" w:hAnsi="Times New Roman" w:cs="Times New Roman"/>
-          <w:noProof/>
-          <w:sz w:val="28"/>
-          <w:szCs w:val="28"/>
-          <w:lang w:eastAsia="uk-UA"/>
-        </w:rPr>
-        <w:drawing>
-          <wp:inline distT="0" distB="0" distL="0" distR="0" wp14:anchorId="360C3C44" wp14:editId="1A1721D8">
-            <wp:extent cx="685896" cy="914528"/>
-            <wp:effectExtent l="0" t="0" r="0" b="0"/>
-            <wp:docPr id="28" name="Рисунок 28"/>
             <wp:cNvGraphicFramePr>
               <a:graphicFrameLocks xmlns:a="http://schemas.openxmlformats.org/drawingml/2006/main" noChangeAspect="1"/>
             </wp:cNvGraphicFramePr>
@@ -12314,7 +12091,7 @@
                   <pic:spPr>
                     <a:xfrm>
                       <a:off x="0" y="0"/>
-                      <a:ext cx="685896" cy="914528"/>
+                      <a:ext cx="3591426" cy="924054"/>
                     </a:xfrm>
                     <a:prstGeom prst="rect">
                       <a:avLst/>
@@ -12326,15 +12103,6 @@
           </wp:inline>
         </w:drawing>
       </w:r>
-      <w:r>
-        <w:rPr>
-          <w:rFonts w:ascii="Times New Roman" w:eastAsia="Times New Roman" w:hAnsi="Times New Roman" w:cs="Times New Roman"/>
-          <w:sz w:val="28"/>
-          <w:szCs w:val="28"/>
-          <w:lang w:eastAsia="uk-UA"/>
-        </w:rPr>
-        <w:t xml:space="preserve"> - це реальна точка на спотвореному зображенні.</w:t>
-      </w:r>
     </w:p>
     <w:p>
       <w:pPr>
@@ -12353,25 +12121,7 @@
           <w:szCs w:val="28"/>
           <w:lang w:eastAsia="uk-UA"/>
         </w:rPr>
-        <w:t xml:space="preserve">Різниця між ними – це похибка зміщення. Суть задачі в тому, що підібрати коефіцієнти </w:t>
-      </w:r>
-      <w:r>
-        <w:rPr>
-          <w:rFonts w:ascii="Times New Roman" w:eastAsia="Times New Roman" w:hAnsi="Times New Roman" w:cs="Times New Roman"/>
-          <w:sz w:val="28"/>
-          <w:szCs w:val="28"/>
-          <w:lang w:val="en-US" w:eastAsia="uk-UA"/>
-        </w:rPr>
-        <w:t>M</w:t>
-      </w:r>
-      <w:r>
-        <w:rPr>
-          <w:rFonts w:ascii="Times New Roman" w:eastAsia="Times New Roman" w:hAnsi="Times New Roman" w:cs="Times New Roman"/>
-          <w:sz w:val="28"/>
-          <w:szCs w:val="28"/>
-          <w:lang w:eastAsia="uk-UA"/>
-        </w:rPr>
-        <w:t>, так щоб сума цих похибок для точок була найменша.</w:t>
+        <w:t>Кожна з 3 пар точок дає 2 лінійних рівняння.</w:t>
       </w:r>
     </w:p>
     <w:p>
@@ -12381,55 +12131,6 @@
           <w:rFonts w:ascii="Times New Roman" w:eastAsia="Times New Roman" w:hAnsi="Times New Roman" w:cs="Times New Roman"/>
           <w:sz w:val="28"/>
           <w:szCs w:val="28"/>
-          <w:lang w:val="ru-RU" w:eastAsia="uk-UA"/>
-        </w:rPr>
-      </w:pPr>
-      <w:r>
-        <w:rPr>
-          <w:rFonts w:ascii="Times New Roman" w:eastAsia="Times New Roman" w:hAnsi="Times New Roman" w:cs="Times New Roman"/>
-          <w:sz w:val="28"/>
-          <w:szCs w:val="28"/>
-          <w:lang w:eastAsia="uk-UA"/>
-        </w:rPr>
-        <w:t>Робиться це таким чином</w:t>
-      </w:r>
-      <w:r>
-        <w:rPr>
-          <w:rFonts w:ascii="Times New Roman" w:eastAsia="Times New Roman" w:hAnsi="Times New Roman" w:cs="Times New Roman"/>
-          <w:sz w:val="28"/>
-          <w:szCs w:val="28"/>
-          <w:lang w:val="ru-RU" w:eastAsia="uk-UA"/>
-        </w:rPr>
-        <w:t>:</w:t>
-      </w:r>
-    </w:p>
-    <w:p>
-      <w:pPr>
-        <w:spacing w:before="100" w:beforeAutospacing="1" w:after="100" w:afterAutospacing="1" w:line="240" w:lineRule="auto"/>
-        <w:rPr>
-          <w:rFonts w:ascii="Times New Roman" w:eastAsia="Times New Roman" w:hAnsi="Times New Roman" w:cs="Times New Roman"/>
-          <w:sz w:val="28"/>
-          <w:szCs w:val="28"/>
-          <w:lang w:eastAsia="uk-UA"/>
-        </w:rPr>
-      </w:pPr>
-      <w:r>
-        <w:rPr>
-          <w:rFonts w:ascii="Times New Roman" w:eastAsia="Times New Roman" w:hAnsi="Times New Roman" w:cs="Times New Roman"/>
-          <w:sz w:val="28"/>
-          <w:szCs w:val="28"/>
-          <w:lang w:eastAsia="uk-UA"/>
-        </w:rPr>
-        <w:t>Спочатку знаходяться центри мас оригінального набору точок та набору на новому зображенні.</w:t>
-      </w:r>
-    </w:p>
-    <w:p>
-      <w:pPr>
-        <w:spacing w:before="100" w:beforeAutospacing="1" w:after="100" w:afterAutospacing="1" w:line="240" w:lineRule="auto"/>
-        <w:rPr>
-          <w:rFonts w:ascii="Times New Roman" w:eastAsia="Times New Roman" w:hAnsi="Times New Roman" w:cs="Times New Roman"/>
-          <w:sz w:val="28"/>
-          <w:szCs w:val="28"/>
           <w:lang w:eastAsia="uk-UA"/>
         </w:rPr>
       </w:pPr>
@@ -12442,10 +12143,10 @@
           <w:lang w:eastAsia="uk-UA"/>
         </w:rPr>
         <w:drawing>
-          <wp:inline distT="0" distB="0" distL="0" distR="0" wp14:anchorId="4E0B5C01" wp14:editId="59E22234">
-            <wp:extent cx="3753374" cy="1114581"/>
+          <wp:inline distT="0" distB="0" distL="0" distR="0" wp14:anchorId="0FCE8C88" wp14:editId="01F208DD">
+            <wp:extent cx="3067478" cy="638264"/>
             <wp:effectExtent l="0" t="0" r="0" b="9525"/>
-            <wp:docPr id="29" name="Рисунок 29"/>
+            <wp:docPr id="15" name="Рисунок 15"/>
             <wp:cNvGraphicFramePr>
               <a:graphicFrameLocks xmlns:a="http://schemas.openxmlformats.org/drawingml/2006/main" noChangeAspect="1"/>
             </wp:cNvGraphicFramePr>
@@ -12465,7 +12166,7 @@
                   <pic:spPr>
                     <a:xfrm>
                       <a:off x="0" y="0"/>
-                      <a:ext cx="3753374" cy="1114581"/>
+                      <a:ext cx="3067478" cy="638264"/>
                     </a:xfrm>
                     <a:prstGeom prst="rect">
                       <a:avLst/>
@@ -12491,54 +12192,16 @@
       <w:r>
         <w:rPr>
           <w:rFonts w:ascii="Times New Roman" w:eastAsia="Times New Roman" w:hAnsi="Times New Roman" w:cs="Times New Roman"/>
-          <w:sz w:val="28"/>
-          <w:szCs w:val="28"/>
-          <w:lang w:eastAsia="uk-UA"/>
-        </w:rPr>
-        <w:t xml:space="preserve">Якщо відняти центри від координат кожної точки, то хмари суміщаються зі своїми центрами в точці </w:t>
-      </w:r>
-      <w:r>
-        <w:rPr>
-          <w:rFonts w:ascii="Times New Roman" w:eastAsia="Times New Roman" w:hAnsi="Times New Roman" w:cs="Times New Roman"/>
-          <w:sz w:val="28"/>
-          <w:szCs w:val="28"/>
-          <w:lang w:eastAsia="uk-UA"/>
-        </w:rPr>
-        <w:t>(0;0</w:t>
-      </w:r>
-      <w:r>
-        <w:rPr>
-          <w:rFonts w:ascii="Times New Roman" w:eastAsia="Times New Roman" w:hAnsi="Times New Roman" w:cs="Times New Roman"/>
-          <w:sz w:val="28"/>
-          <w:szCs w:val="28"/>
-          <w:lang w:eastAsia="uk-UA"/>
-        </w:rPr>
-        <w:t>) і вектор зсуву тимчасово нівелюється.</w:t>
-      </w:r>
-    </w:p>
-    <w:p>
-      <w:pPr>
-        <w:spacing w:before="100" w:beforeAutospacing="1" w:after="100" w:afterAutospacing="1" w:line="240" w:lineRule="auto"/>
-        <w:rPr>
-          <w:rFonts w:ascii="Times New Roman" w:eastAsia="Times New Roman" w:hAnsi="Times New Roman" w:cs="Times New Roman"/>
-          <w:sz w:val="28"/>
-          <w:szCs w:val="28"/>
-          <w:lang w:eastAsia="uk-UA"/>
-        </w:rPr>
-      </w:pPr>
-      <w:r>
-        <w:rPr>
-          <w:rFonts w:ascii="Times New Roman" w:eastAsia="Times New Roman" w:hAnsi="Times New Roman" w:cs="Times New Roman"/>
           <w:noProof/>
           <w:sz w:val="28"/>
           <w:szCs w:val="28"/>
           <w:lang w:eastAsia="uk-UA"/>
         </w:rPr>
         <w:drawing>
-          <wp:inline distT="0" distB="0" distL="0" distR="0" wp14:anchorId="3630DE44" wp14:editId="2D8F032C">
-            <wp:extent cx="3400900" cy="590632"/>
+          <wp:inline distT="0" distB="0" distL="0" distR="0" wp14:anchorId="3D4AB664" wp14:editId="7643E555">
+            <wp:extent cx="3000794" cy="724001"/>
             <wp:effectExtent l="0" t="0" r="9525" b="0"/>
-            <wp:docPr id="30" name="Рисунок 30"/>
+            <wp:docPr id="17" name="Рисунок 17"/>
             <wp:cNvGraphicFramePr>
               <a:graphicFrameLocks xmlns:a="http://schemas.openxmlformats.org/drawingml/2006/main" noChangeAspect="1"/>
             </wp:cNvGraphicFramePr>
@@ -12558,7 +12221,7 @@
                   <pic:spPr>
                     <a:xfrm>
                       <a:off x="0" y="0"/>
-                      <a:ext cx="3400900" cy="590632"/>
+                      <a:ext cx="3000794" cy="724001"/>
                     </a:xfrm>
                     <a:prstGeom prst="rect">
                       <a:avLst/>
@@ -12570,15 +12233,6 @@
           </wp:inline>
         </w:drawing>
       </w:r>
-      <w:r>
-        <w:rPr>
-          <w:rFonts w:ascii="Times New Roman" w:eastAsia="Times New Roman" w:hAnsi="Times New Roman" w:cs="Times New Roman"/>
-          <w:sz w:val="28"/>
-          <w:szCs w:val="28"/>
-          <w:lang w:eastAsia="uk-UA"/>
-        </w:rPr>
-        <w:t>Залишається лише чистий поворот.</w:t>
-      </w:r>
     </w:p>
     <w:p>
       <w:pPr>
@@ -12597,7 +12251,7 @@
           <w:szCs w:val="28"/>
           <w:lang w:eastAsia="uk-UA"/>
         </w:rPr>
-        <w:t>Далі будується матриця взаємної коваріації.</w:t>
+        <w:t>Всього таких рівнянь буде 6 і саме 6 змінних нам треба знайти. В матричному вигляді це наступна система</w:t>
       </w:r>
     </w:p>
     <w:p>
@@ -12619,10 +12273,10 @@
           <w:lang w:eastAsia="uk-UA"/>
         </w:rPr>
         <w:drawing>
-          <wp:inline distT="0" distB="0" distL="0" distR="0" wp14:anchorId="13AAC3B9" wp14:editId="6DE4F355">
-            <wp:extent cx="4658375" cy="1105054"/>
-            <wp:effectExtent l="0" t="0" r="8890" b="0"/>
-            <wp:docPr id="31" name="Рисунок 31"/>
+          <wp:inline distT="0" distB="0" distL="0" distR="0" wp14:anchorId="25C1D7E8" wp14:editId="188493A9">
+            <wp:extent cx="4534533" cy="2010056"/>
+            <wp:effectExtent l="0" t="0" r="0" b="9525"/>
+            <wp:docPr id="18" name="Рисунок 18"/>
             <wp:cNvGraphicFramePr>
               <a:graphicFrameLocks xmlns:a="http://schemas.openxmlformats.org/drawingml/2006/main" noChangeAspect="1"/>
             </wp:cNvGraphicFramePr>
@@ -12642,7 +12296,7 @@
                   <pic:spPr>
                     <a:xfrm>
                       <a:off x="0" y="0"/>
-                      <a:ext cx="4658375" cy="1105054"/>
+                      <a:ext cx="4534533" cy="2010056"/>
                     </a:xfrm>
                     <a:prstGeom prst="rect">
                       <a:avLst/>
@@ -12672,7 +12326,61 @@
           <w:szCs w:val="28"/>
           <w:lang w:eastAsia="uk-UA"/>
         </w:rPr>
-        <w:t>Це матриця 2 на 2.</w:t>
+        <w:t xml:space="preserve">В матричній формі </w:t>
+      </w:r>
+      <w:r>
+        <w:rPr>
+          <w:rFonts w:ascii="Times New Roman" w:eastAsia="Times New Roman" w:hAnsi="Times New Roman" w:cs="Times New Roman"/>
+          <w:sz w:val="28"/>
+          <w:szCs w:val="28"/>
+          <w:lang w:val="en-US" w:eastAsia="uk-UA"/>
+        </w:rPr>
+        <w:t>A</w:t>
+      </w:r>
+      <w:r>
+        <w:rPr>
+          <w:rFonts w:ascii="Times New Roman" w:eastAsia="Times New Roman" w:hAnsi="Times New Roman" w:cs="Times New Roman"/>
+          <w:sz w:val="28"/>
+          <w:szCs w:val="28"/>
+          <w:lang w:val="ru-RU" w:eastAsia="uk-UA"/>
+        </w:rPr>
+        <w:t xml:space="preserve"> * </w:t>
+      </w:r>
+      <w:r>
+        <w:rPr>
+          <w:rFonts w:ascii="Times New Roman" w:eastAsia="Times New Roman" w:hAnsi="Times New Roman" w:cs="Times New Roman"/>
+          <w:sz w:val="28"/>
+          <w:szCs w:val="28"/>
+          <w:lang w:val="en-US" w:eastAsia="uk-UA"/>
+        </w:rPr>
+        <w:t>h</w:t>
+      </w:r>
+      <w:r>
+        <w:rPr>
+          <w:rFonts w:ascii="Times New Roman" w:eastAsia="Times New Roman" w:hAnsi="Times New Roman" w:cs="Times New Roman"/>
+          <w:sz w:val="28"/>
+          <w:szCs w:val="28"/>
+          <w:lang w:val="ru-RU" w:eastAsia="uk-UA"/>
+        </w:rPr>
+        <w:t xml:space="preserve"> = </w:t>
+      </w:r>
+      <w:r>
+        <w:rPr>
+          <w:rFonts w:ascii="Times New Roman" w:eastAsia="Times New Roman" w:hAnsi="Times New Roman" w:cs="Times New Roman"/>
+          <w:sz w:val="28"/>
+          <w:szCs w:val="28"/>
+          <w:lang w:val="en-US" w:eastAsia="uk-UA"/>
+        </w:rPr>
+        <w:t>b</w:t>
+      </w:r>
+      <w:r>
+        <w:rPr>
+          <w:rFonts w:ascii="Times New Roman" w:eastAsia="Times New Roman" w:hAnsi="Times New Roman" w:cs="Times New Roman"/>
+          <w:sz w:val="28"/>
+          <w:szCs w:val="28"/>
+          <w:lang w:eastAsia="uk-UA"/>
+        </w:rPr>
+        <w:t>, звідки</w:t>
       </w:r>
     </w:p>
     <w:p>
@@ -12682,45 +12390,7 @@
           <w:rFonts w:ascii="Times New Roman" w:eastAsia="Times New Roman" w:hAnsi="Times New Roman" w:cs="Times New Roman"/>
           <w:sz w:val="28"/>
           <w:szCs w:val="28"/>
-          <w:lang w:val="ru-RU" w:eastAsia="uk-UA"/>
-        </w:rPr>
-      </w:pPr>
-      <w:r>
-        <w:rPr>
-          <w:rFonts w:ascii="Times New Roman" w:eastAsia="Times New Roman" w:hAnsi="Times New Roman" w:cs="Times New Roman"/>
-          <w:sz w:val="28"/>
-          <w:szCs w:val="28"/>
-          <w:lang w:eastAsia="uk-UA"/>
-        </w:rPr>
-        <w:t xml:space="preserve">Далі робиться сингулярний розклад матриці </w:t>
-      </w:r>
-      <w:r>
-        <w:rPr>
-          <w:rFonts w:ascii="Times New Roman" w:eastAsia="Times New Roman" w:hAnsi="Times New Roman" w:cs="Times New Roman"/>
-          <w:sz w:val="28"/>
-          <w:szCs w:val="28"/>
-          <w:lang w:val="en-US" w:eastAsia="uk-UA"/>
-        </w:rPr>
-        <w:t>H</w:t>
-      </w:r>
-      <w:r>
-        <w:rPr>
-          <w:rFonts w:ascii="Times New Roman" w:eastAsia="Times New Roman" w:hAnsi="Times New Roman" w:cs="Times New Roman"/>
-          <w:sz w:val="28"/>
-          <w:szCs w:val="28"/>
-          <w:lang w:val="ru-RU" w:eastAsia="uk-UA"/>
-        </w:rPr>
-        <w:t>.</w:t>
-      </w:r>
-    </w:p>
-    <w:p>
-      <w:pPr>
-        <w:spacing w:before="100" w:beforeAutospacing="1" w:after="100" w:afterAutospacing="1" w:line="240" w:lineRule="auto"/>
-        <w:rPr>
-          <w:rFonts w:ascii="Times New Roman" w:eastAsia="Times New Roman" w:hAnsi="Times New Roman" w:cs="Times New Roman"/>
-          <w:sz w:val="28"/>
-          <w:szCs w:val="28"/>
-          <w:lang w:val="ru-RU" w:eastAsia="uk-UA"/>
+          <w:lang w:eastAsia="uk-UA"/>
         </w:rPr>
       </w:pPr>
       <w:r>
@@ -12732,10 +12402,10 @@
           <w:lang w:eastAsia="uk-UA"/>
         </w:rPr>
         <w:drawing>
-          <wp:inline distT="0" distB="0" distL="0" distR="0" wp14:anchorId="6364A9F0" wp14:editId="771F0EDE">
-            <wp:extent cx="1581371" cy="523948"/>
-            <wp:effectExtent l="0" t="0" r="0" b="9525"/>
-            <wp:docPr id="32" name="Рисунок 32"/>
+          <wp:inline distT="0" distB="0" distL="0" distR="0" wp14:anchorId="31216C99" wp14:editId="6A4FF7E1">
+            <wp:extent cx="1257475" cy="514422"/>
+            <wp:effectExtent l="0" t="0" r="0" b="0"/>
+            <wp:docPr id="20" name="Рисунок 20"/>
             <wp:cNvGraphicFramePr>
               <a:graphicFrameLocks xmlns:a="http://schemas.openxmlformats.org/drawingml/2006/main" noChangeAspect="1"/>
             </wp:cNvGraphicFramePr>
@@ -12755,6 +12425,789 @@
                   <pic:spPr>
                     <a:xfrm>
                       <a:off x="0" y="0"/>
+                      <a:ext cx="1257475" cy="514422"/>
+                    </a:xfrm>
+                    <a:prstGeom prst="rect">
+                      <a:avLst/>
+                    </a:prstGeom>
+                  </pic:spPr>
+                </pic:pic>
+              </a:graphicData>
+            </a:graphic>
+          </wp:inline>
+        </w:drawing>
+      </w:r>
+    </w:p>
+    <w:p>
+      <w:pPr>
+        <w:spacing w:before="100" w:beforeAutospacing="1" w:after="100" w:afterAutospacing="1" w:line="240" w:lineRule="auto"/>
+        <w:rPr>
+          <w:rFonts w:ascii="Times New Roman" w:eastAsia="Times New Roman" w:hAnsi="Times New Roman" w:cs="Times New Roman"/>
+          <w:sz w:val="28"/>
+          <w:szCs w:val="28"/>
+          <w:lang w:eastAsia="uk-UA"/>
+        </w:rPr>
+      </w:pPr>
+      <w:r>
+        <w:rPr>
+          <w:rFonts w:ascii="Times New Roman" w:eastAsia="Times New Roman" w:hAnsi="Times New Roman" w:cs="Times New Roman"/>
+          <w:sz w:val="28"/>
+          <w:szCs w:val="28"/>
+          <w:lang w:eastAsia="uk-UA"/>
+        </w:rPr>
+        <w:t xml:space="preserve">Так будуються орієнтовні матриці. Обирається та матриця </w:t>
+      </w:r>
+      <w:r>
+        <w:rPr>
+          <w:rFonts w:ascii="Times New Roman" w:eastAsia="Times New Roman" w:hAnsi="Times New Roman" w:cs="Times New Roman"/>
+          <w:sz w:val="28"/>
+          <w:szCs w:val="28"/>
+          <w:lang w:val="en-US" w:eastAsia="uk-UA"/>
+        </w:rPr>
+        <w:t>M</w:t>
+      </w:r>
+      <w:r>
+        <w:rPr>
+          <w:rFonts w:ascii="Times New Roman" w:eastAsia="Times New Roman" w:hAnsi="Times New Roman" w:cs="Times New Roman"/>
+          <w:sz w:val="28"/>
+          <w:szCs w:val="28"/>
+          <w:lang w:eastAsia="uk-UA"/>
+        </w:rPr>
+        <w:t>, яка мала найбільшу кількість інлаєрів, а потім вона уточнюється.</w:t>
+      </w:r>
+    </w:p>
+    <w:p>
+      <w:pPr>
+        <w:spacing w:before="100" w:beforeAutospacing="1" w:after="100" w:afterAutospacing="1" w:line="240" w:lineRule="auto"/>
+        <w:rPr>
+          <w:rFonts w:ascii="Times New Roman" w:eastAsia="Times New Roman" w:hAnsi="Times New Roman" w:cs="Times New Roman"/>
+          <w:sz w:val="28"/>
+          <w:szCs w:val="28"/>
+          <w:lang w:eastAsia="uk-UA"/>
+        </w:rPr>
+      </w:pPr>
+      <w:r>
+        <w:rPr>
+          <w:rFonts w:ascii="Times New Roman" w:eastAsia="Times New Roman" w:hAnsi="Times New Roman" w:cs="Times New Roman"/>
+          <w:sz w:val="28"/>
+          <w:szCs w:val="28"/>
+          <w:lang w:eastAsia="uk-UA"/>
+        </w:rPr>
+        <w:t xml:space="preserve">Нехай після уточнення маємо матрицю </w:t>
+      </w:r>
+      <w:r>
+        <w:rPr>
+          <w:rFonts w:ascii="Times New Roman" w:eastAsia="Times New Roman" w:hAnsi="Times New Roman" w:cs="Times New Roman"/>
+          <w:sz w:val="28"/>
+          <w:szCs w:val="28"/>
+          <w:lang w:val="en-US" w:eastAsia="uk-UA"/>
+        </w:rPr>
+        <w:t>M</w:t>
+      </w:r>
+      <w:r>
+        <w:rPr>
+          <w:rFonts w:ascii="Times New Roman" w:eastAsia="Times New Roman" w:hAnsi="Times New Roman" w:cs="Times New Roman"/>
+          <w:sz w:val="28"/>
+          <w:szCs w:val="28"/>
+          <w:lang w:eastAsia="uk-UA"/>
+        </w:rPr>
+        <w:t xml:space="preserve"> </w:t>
+      </w:r>
+      <w:r>
+        <w:rPr>
+          <w:rFonts w:ascii="Times New Roman" w:eastAsia="Times New Roman" w:hAnsi="Times New Roman" w:cs="Times New Roman"/>
+          <w:sz w:val="28"/>
+          <w:szCs w:val="28"/>
+          <w:lang w:val="en-US" w:eastAsia="uk-UA"/>
+        </w:rPr>
+        <w:t>i</w:t>
+      </w:r>
+      <w:r>
+        <w:rPr>
+          <w:rFonts w:ascii="Times New Roman" w:eastAsia="Times New Roman" w:hAnsi="Times New Roman" w:cs="Times New Roman"/>
+          <w:sz w:val="28"/>
+          <w:szCs w:val="28"/>
+          <w:lang w:eastAsia="uk-UA"/>
+        </w:rPr>
+        <w:t xml:space="preserve"> </w:t>
+      </w:r>
+      <w:r>
+        <w:rPr>
+          <w:rFonts w:ascii="Times New Roman" w:eastAsia="Times New Roman" w:hAnsi="Times New Roman" w:cs="Times New Roman"/>
+          <w:sz w:val="28"/>
+          <w:szCs w:val="28"/>
+          <w:lang w:val="en-US" w:eastAsia="uk-UA"/>
+        </w:rPr>
+        <w:t>K</w:t>
+      </w:r>
+      <w:r>
+        <w:rPr>
+          <w:rFonts w:ascii="Times New Roman" w:eastAsia="Times New Roman" w:hAnsi="Times New Roman" w:cs="Times New Roman"/>
+          <w:sz w:val="28"/>
+          <w:szCs w:val="28"/>
+          <w:lang w:eastAsia="uk-UA"/>
+        </w:rPr>
+        <w:t xml:space="preserve"> </w:t>
+      </w:r>
+      <w:r>
+        <w:rPr>
+          <w:rFonts w:ascii="Times New Roman" w:eastAsia="Times New Roman" w:hAnsi="Times New Roman" w:cs="Times New Roman"/>
+          <w:sz w:val="28"/>
+          <w:szCs w:val="28"/>
+          <w:lang w:eastAsia="uk-UA"/>
+        </w:rPr>
+        <w:t>надійних інлаєрів.</w:t>
+      </w:r>
+    </w:p>
+    <w:p>
+      <w:pPr>
+        <w:spacing w:before="100" w:beforeAutospacing="1" w:after="100" w:afterAutospacing="1" w:line="240" w:lineRule="auto"/>
+        <w:rPr>
+          <w:rFonts w:ascii="Times New Roman" w:eastAsia="Times New Roman" w:hAnsi="Times New Roman" w:cs="Times New Roman"/>
+          <w:sz w:val="28"/>
+          <w:szCs w:val="28"/>
+          <w:lang w:eastAsia="uk-UA"/>
+        </w:rPr>
+      </w:pPr>
+      <w:r>
+        <w:rPr>
+          <w:rFonts w:ascii="Times New Roman" w:eastAsia="Times New Roman" w:hAnsi="Times New Roman" w:cs="Times New Roman"/>
+          <w:sz w:val="28"/>
+          <w:szCs w:val="28"/>
+          <w:lang w:eastAsia="uk-UA"/>
+        </w:rPr>
+        <w:t>Далі необхідно вирішити задачу оптимізації за методом найменших квадратів.</w:t>
+      </w:r>
+    </w:p>
+    <w:p>
+      <w:pPr>
+        <w:spacing w:before="100" w:beforeAutospacing="1" w:after="100" w:afterAutospacing="1" w:line="240" w:lineRule="auto"/>
+        <w:rPr>
+          <w:rFonts w:ascii="Times New Roman" w:eastAsia="Times New Roman" w:hAnsi="Times New Roman" w:cs="Times New Roman"/>
+          <w:sz w:val="28"/>
+          <w:szCs w:val="28"/>
+          <w:lang w:eastAsia="uk-UA"/>
+        </w:rPr>
+      </w:pPr>
+      <w:r>
+        <w:rPr>
+          <w:rFonts w:ascii="Times New Roman" w:eastAsia="Times New Roman" w:hAnsi="Times New Roman" w:cs="Times New Roman"/>
+          <w:noProof/>
+          <w:sz w:val="28"/>
+          <w:szCs w:val="28"/>
+          <w:lang w:eastAsia="uk-UA"/>
+        </w:rPr>
+        <w:lastRenderedPageBreak/>
+        <w:drawing>
+          <wp:inline distT="0" distB="0" distL="0" distR="0" wp14:anchorId="18E56BD3" wp14:editId="34664582">
+            <wp:extent cx="3200847" cy="1286054"/>
+            <wp:effectExtent l="0" t="0" r="0" b="0"/>
+            <wp:docPr id="21" name="Рисунок 21"/>
+            <wp:cNvGraphicFramePr>
+              <a:graphicFrameLocks xmlns:a="http://schemas.openxmlformats.org/drawingml/2006/main" noChangeAspect="1"/>
+            </wp:cNvGraphicFramePr>
+            <a:graphic xmlns:a="http://schemas.openxmlformats.org/drawingml/2006/main">
+              <a:graphicData uri="http://schemas.openxmlformats.org/drawingml/2006/picture">
+                <pic:pic xmlns:pic="http://schemas.openxmlformats.org/drawingml/2006/picture">
+                  <pic:nvPicPr>
+                    <pic:cNvPr id="1" name=""/>
+                    <pic:cNvPicPr/>
+                  </pic:nvPicPr>
+                  <pic:blipFill>
+                    <a:blip r:embed="rId36"/>
+                    <a:stretch>
+                      <a:fillRect/>
+                    </a:stretch>
+                  </pic:blipFill>
+                  <pic:spPr>
+                    <a:xfrm>
+                      <a:off x="0" y="0"/>
+                      <a:ext cx="3200847" cy="1286054"/>
+                    </a:xfrm>
+                    <a:prstGeom prst="rect">
+                      <a:avLst/>
+                    </a:prstGeom>
+                  </pic:spPr>
+                </pic:pic>
+              </a:graphicData>
+            </a:graphic>
+          </wp:inline>
+        </w:drawing>
+      </w:r>
+    </w:p>
+    <w:p>
+      <w:pPr>
+        <w:spacing w:before="100" w:beforeAutospacing="1" w:after="100" w:afterAutospacing="1" w:line="240" w:lineRule="auto"/>
+        <w:rPr>
+          <w:rFonts w:ascii="Times New Roman" w:eastAsia="Times New Roman" w:hAnsi="Times New Roman" w:cs="Times New Roman"/>
+          <w:sz w:val="28"/>
+          <w:szCs w:val="28"/>
+          <w:lang w:eastAsia="uk-UA"/>
+        </w:rPr>
+      </w:pPr>
+      <w:r>
+        <w:rPr>
+          <w:rFonts w:ascii="Times New Roman" w:eastAsia="Times New Roman" w:hAnsi="Times New Roman" w:cs="Times New Roman"/>
+          <w:sz w:val="28"/>
+          <w:szCs w:val="28"/>
+          <w:lang w:eastAsia="uk-UA"/>
+        </w:rPr>
+        <w:t xml:space="preserve">Тут </w:t>
+      </w:r>
+      <w:r>
+        <w:rPr>
+          <w:rFonts w:ascii="Times New Roman" w:eastAsia="Times New Roman" w:hAnsi="Times New Roman" w:cs="Times New Roman"/>
+          <w:noProof/>
+          <w:sz w:val="28"/>
+          <w:szCs w:val="28"/>
+          <w:lang w:eastAsia="uk-UA"/>
+        </w:rPr>
+        <w:drawing>
+          <wp:inline distT="0" distB="0" distL="0" distR="0" wp14:anchorId="52856D7C" wp14:editId="63C5FF0B">
+            <wp:extent cx="971686" cy="1066949"/>
+            <wp:effectExtent l="0" t="0" r="0" b="0"/>
+            <wp:docPr id="22" name="Рисунок 22"/>
+            <wp:cNvGraphicFramePr>
+              <a:graphicFrameLocks xmlns:a="http://schemas.openxmlformats.org/drawingml/2006/main" noChangeAspect="1"/>
+            </wp:cNvGraphicFramePr>
+            <a:graphic xmlns:a="http://schemas.openxmlformats.org/drawingml/2006/main">
+              <a:graphicData uri="http://schemas.openxmlformats.org/drawingml/2006/picture">
+                <pic:pic xmlns:pic="http://schemas.openxmlformats.org/drawingml/2006/picture">
+                  <pic:nvPicPr>
+                    <pic:cNvPr id="1" name=""/>
+                    <pic:cNvPicPr/>
+                  </pic:nvPicPr>
+                  <pic:blipFill>
+                    <a:blip r:embed="rId37"/>
+                    <a:stretch>
+                      <a:fillRect/>
+                    </a:stretch>
+                  </pic:blipFill>
+                  <pic:spPr>
+                    <a:xfrm>
+                      <a:off x="0" y="0"/>
+                      <a:ext cx="971686" cy="1066949"/>
+                    </a:xfrm>
+                    <a:prstGeom prst="rect">
+                      <a:avLst/>
+                    </a:prstGeom>
+                  </pic:spPr>
+                </pic:pic>
+              </a:graphicData>
+            </a:graphic>
+          </wp:inline>
+        </w:drawing>
+      </w:r>
+      <w:r>
+        <w:rPr>
+          <w:rFonts w:ascii="Times New Roman" w:eastAsia="Times New Roman" w:hAnsi="Times New Roman" w:cs="Times New Roman"/>
+          <w:sz w:val="28"/>
+          <w:szCs w:val="28"/>
+          <w:lang w:eastAsia="uk-UA"/>
+        </w:rPr>
+        <w:t xml:space="preserve"> - це точка, куди має перенестись </w:t>
+      </w:r>
+      <w:r>
+        <w:rPr>
+          <w:rFonts w:ascii="Times New Roman" w:eastAsia="Times New Roman" w:hAnsi="Times New Roman" w:cs="Times New Roman"/>
+          <w:sz w:val="28"/>
+          <w:szCs w:val="28"/>
+          <w:lang w:val="en-US" w:eastAsia="uk-UA"/>
+        </w:rPr>
+        <w:t>i</w:t>
+      </w:r>
+      <w:r>
+        <w:rPr>
+          <w:rFonts w:ascii="Times New Roman" w:eastAsia="Times New Roman" w:hAnsi="Times New Roman" w:cs="Times New Roman"/>
+          <w:sz w:val="28"/>
+          <w:szCs w:val="28"/>
+          <w:lang w:val="ru-RU" w:eastAsia="uk-UA"/>
+        </w:rPr>
+        <w:t>-</w:t>
+      </w:r>
+      <w:r>
+        <w:rPr>
+          <w:rFonts w:ascii="Times New Roman" w:eastAsia="Times New Roman" w:hAnsi="Times New Roman" w:cs="Times New Roman"/>
+          <w:sz w:val="28"/>
+          <w:szCs w:val="28"/>
+          <w:lang w:eastAsia="uk-UA"/>
+        </w:rPr>
+        <w:t xml:space="preserve">а вхідна точка згідно з нашою моделлю. </w:t>
+      </w:r>
+      <w:r>
+        <w:rPr>
+          <w:rFonts w:ascii="Times New Roman" w:eastAsia="Times New Roman" w:hAnsi="Times New Roman" w:cs="Times New Roman"/>
+          <w:noProof/>
+          <w:sz w:val="28"/>
+          <w:szCs w:val="28"/>
+          <w:lang w:eastAsia="uk-UA"/>
+        </w:rPr>
+        <w:drawing>
+          <wp:inline distT="0" distB="0" distL="0" distR="0" wp14:anchorId="3DD63066" wp14:editId="5D0B8601">
+            <wp:extent cx="685896" cy="914528"/>
+            <wp:effectExtent l="0" t="0" r="0" b="0"/>
+            <wp:docPr id="28" name="Рисунок 28"/>
+            <wp:cNvGraphicFramePr>
+              <a:graphicFrameLocks xmlns:a="http://schemas.openxmlformats.org/drawingml/2006/main" noChangeAspect="1"/>
+            </wp:cNvGraphicFramePr>
+            <a:graphic xmlns:a="http://schemas.openxmlformats.org/drawingml/2006/main">
+              <a:graphicData uri="http://schemas.openxmlformats.org/drawingml/2006/picture">
+                <pic:pic xmlns:pic="http://schemas.openxmlformats.org/drawingml/2006/picture">
+                  <pic:nvPicPr>
+                    <pic:cNvPr id="1" name=""/>
+                    <pic:cNvPicPr/>
+                  </pic:nvPicPr>
+                  <pic:blipFill>
+                    <a:blip r:embed="rId38"/>
+                    <a:stretch>
+                      <a:fillRect/>
+                    </a:stretch>
+                  </pic:blipFill>
+                  <pic:spPr>
+                    <a:xfrm>
+                      <a:off x="0" y="0"/>
+                      <a:ext cx="685896" cy="914528"/>
+                    </a:xfrm>
+                    <a:prstGeom prst="rect">
+                      <a:avLst/>
+                    </a:prstGeom>
+                  </pic:spPr>
+                </pic:pic>
+              </a:graphicData>
+            </a:graphic>
+          </wp:inline>
+        </w:drawing>
+      </w:r>
+      <w:r>
+        <w:rPr>
+          <w:rFonts w:ascii="Times New Roman" w:eastAsia="Times New Roman" w:hAnsi="Times New Roman" w:cs="Times New Roman"/>
+          <w:sz w:val="28"/>
+          <w:szCs w:val="28"/>
+          <w:lang w:eastAsia="uk-UA"/>
+        </w:rPr>
+        <w:t xml:space="preserve"> - це реальна точка на спотвореному зображенні.</w:t>
+      </w:r>
+    </w:p>
+    <w:p>
+      <w:pPr>
+        <w:spacing w:before="100" w:beforeAutospacing="1" w:after="100" w:afterAutospacing="1" w:line="240" w:lineRule="auto"/>
+        <w:rPr>
+          <w:rFonts w:ascii="Times New Roman" w:eastAsia="Times New Roman" w:hAnsi="Times New Roman" w:cs="Times New Roman"/>
+          <w:sz w:val="28"/>
+          <w:szCs w:val="28"/>
+          <w:lang w:eastAsia="uk-UA"/>
+        </w:rPr>
+      </w:pPr>
+      <w:r>
+        <w:rPr>
+          <w:rFonts w:ascii="Times New Roman" w:eastAsia="Times New Roman" w:hAnsi="Times New Roman" w:cs="Times New Roman"/>
+          <w:sz w:val="28"/>
+          <w:szCs w:val="28"/>
+          <w:lang w:eastAsia="uk-UA"/>
+        </w:rPr>
+        <w:t xml:space="preserve">Різниця між ними – це похибка зміщення. Суть задачі в тому, що підібрати коефіцієнти </w:t>
+      </w:r>
+      <w:r>
+        <w:rPr>
+          <w:rFonts w:ascii="Times New Roman" w:eastAsia="Times New Roman" w:hAnsi="Times New Roman" w:cs="Times New Roman"/>
+          <w:sz w:val="28"/>
+          <w:szCs w:val="28"/>
+          <w:lang w:val="en-US" w:eastAsia="uk-UA"/>
+        </w:rPr>
+        <w:t>M</w:t>
+      </w:r>
+      <w:r>
+        <w:rPr>
+          <w:rFonts w:ascii="Times New Roman" w:eastAsia="Times New Roman" w:hAnsi="Times New Roman" w:cs="Times New Roman"/>
+          <w:sz w:val="28"/>
+          <w:szCs w:val="28"/>
+          <w:lang w:eastAsia="uk-UA"/>
+        </w:rPr>
+        <w:t>, так щоб сума цих похибок для точок була найменша.</w:t>
+      </w:r>
+    </w:p>
+    <w:p>
+      <w:pPr>
+        <w:spacing w:before="100" w:beforeAutospacing="1" w:after="100" w:afterAutospacing="1" w:line="240" w:lineRule="auto"/>
+        <w:rPr>
+          <w:rFonts w:ascii="Times New Roman" w:eastAsia="Times New Roman" w:hAnsi="Times New Roman" w:cs="Times New Roman"/>
+          <w:sz w:val="28"/>
+          <w:szCs w:val="28"/>
+          <w:lang w:val="ru-RU" w:eastAsia="uk-UA"/>
+        </w:rPr>
+      </w:pPr>
+      <w:r>
+        <w:rPr>
+          <w:rFonts w:ascii="Times New Roman" w:eastAsia="Times New Roman" w:hAnsi="Times New Roman" w:cs="Times New Roman"/>
+          <w:sz w:val="28"/>
+          <w:szCs w:val="28"/>
+          <w:lang w:eastAsia="uk-UA"/>
+        </w:rPr>
+        <w:t>Робиться це таким чином</w:t>
+      </w:r>
+      <w:r>
+        <w:rPr>
+          <w:rFonts w:ascii="Times New Roman" w:eastAsia="Times New Roman" w:hAnsi="Times New Roman" w:cs="Times New Roman"/>
+          <w:sz w:val="28"/>
+          <w:szCs w:val="28"/>
+          <w:lang w:val="ru-RU" w:eastAsia="uk-UA"/>
+        </w:rPr>
+        <w:t>:</w:t>
+      </w:r>
+    </w:p>
+    <w:p>
+      <w:pPr>
+        <w:spacing w:before="100" w:beforeAutospacing="1" w:after="100" w:afterAutospacing="1" w:line="240" w:lineRule="auto"/>
+        <w:rPr>
+          <w:rFonts w:ascii="Times New Roman" w:eastAsia="Times New Roman" w:hAnsi="Times New Roman" w:cs="Times New Roman"/>
+          <w:sz w:val="28"/>
+          <w:szCs w:val="28"/>
+          <w:lang w:eastAsia="uk-UA"/>
+        </w:rPr>
+      </w:pPr>
+      <w:r>
+        <w:rPr>
+          <w:rFonts w:ascii="Times New Roman" w:eastAsia="Times New Roman" w:hAnsi="Times New Roman" w:cs="Times New Roman"/>
+          <w:sz w:val="28"/>
+          <w:szCs w:val="28"/>
+          <w:lang w:eastAsia="uk-UA"/>
+        </w:rPr>
+        <w:t>Спочатку знаходяться центри мас оригінального набору точок та набору на новому зображенні.</w:t>
+      </w:r>
+    </w:p>
+    <w:p>
+      <w:pPr>
+        <w:spacing w:before="100" w:beforeAutospacing="1" w:after="100" w:afterAutospacing="1" w:line="240" w:lineRule="auto"/>
+        <w:rPr>
+          <w:rFonts w:ascii="Times New Roman" w:eastAsia="Times New Roman" w:hAnsi="Times New Roman" w:cs="Times New Roman"/>
+          <w:sz w:val="28"/>
+          <w:szCs w:val="28"/>
+          <w:lang w:eastAsia="uk-UA"/>
+        </w:rPr>
+      </w:pPr>
+      <w:r>
+        <w:rPr>
+          <w:rFonts w:ascii="Times New Roman" w:eastAsia="Times New Roman" w:hAnsi="Times New Roman" w:cs="Times New Roman"/>
+          <w:noProof/>
+          <w:sz w:val="28"/>
+          <w:szCs w:val="28"/>
+          <w:lang w:eastAsia="uk-UA"/>
+        </w:rPr>
+        <w:drawing>
+          <wp:inline distT="0" distB="0" distL="0" distR="0" wp14:anchorId="1E20C31C" wp14:editId="69E9CE7A">
+            <wp:extent cx="3753374" cy="1114581"/>
+            <wp:effectExtent l="0" t="0" r="0" b="9525"/>
+            <wp:docPr id="29" name="Рисунок 29"/>
+            <wp:cNvGraphicFramePr>
+              <a:graphicFrameLocks xmlns:a="http://schemas.openxmlformats.org/drawingml/2006/main" noChangeAspect="1"/>
+            </wp:cNvGraphicFramePr>
+            <a:graphic xmlns:a="http://schemas.openxmlformats.org/drawingml/2006/main">
+              <a:graphicData uri="http://schemas.openxmlformats.org/drawingml/2006/picture">
+                <pic:pic xmlns:pic="http://schemas.openxmlformats.org/drawingml/2006/picture">
+                  <pic:nvPicPr>
+                    <pic:cNvPr id="1" name=""/>
+                    <pic:cNvPicPr/>
+                  </pic:nvPicPr>
+                  <pic:blipFill>
+                    <a:blip r:embed="rId39"/>
+                    <a:stretch>
+                      <a:fillRect/>
+                    </a:stretch>
+                  </pic:blipFill>
+                  <pic:spPr>
+                    <a:xfrm>
+                      <a:off x="0" y="0"/>
+                      <a:ext cx="3753374" cy="1114581"/>
+                    </a:xfrm>
+                    <a:prstGeom prst="rect">
+                      <a:avLst/>
+                    </a:prstGeom>
+                  </pic:spPr>
+                </pic:pic>
+              </a:graphicData>
+            </a:graphic>
+          </wp:inline>
+        </w:drawing>
+      </w:r>
+    </w:p>
+    <w:p>
+      <w:pPr>
+        <w:spacing w:before="100" w:beforeAutospacing="1" w:after="100" w:afterAutospacing="1" w:line="240" w:lineRule="auto"/>
+        <w:rPr>
+          <w:rFonts w:ascii="Times New Roman" w:eastAsia="Times New Roman" w:hAnsi="Times New Roman" w:cs="Times New Roman"/>
+          <w:sz w:val="28"/>
+          <w:szCs w:val="28"/>
+          <w:lang w:eastAsia="uk-UA"/>
+        </w:rPr>
+      </w:pPr>
+      <w:r>
+        <w:rPr>
+          <w:rFonts w:ascii="Times New Roman" w:eastAsia="Times New Roman" w:hAnsi="Times New Roman" w:cs="Times New Roman"/>
+          <w:sz w:val="28"/>
+          <w:szCs w:val="28"/>
+          <w:lang w:eastAsia="uk-UA"/>
+        </w:rPr>
+        <w:t xml:space="preserve">Якщо відняти центри від координат кожної точки, то хмари суміщаються зі своїми центрами в точці </w:t>
+      </w:r>
+      <w:r>
+        <w:rPr>
+          <w:rFonts w:ascii="Times New Roman" w:eastAsia="Times New Roman" w:hAnsi="Times New Roman" w:cs="Times New Roman"/>
+          <w:sz w:val="28"/>
+          <w:szCs w:val="28"/>
+          <w:lang w:eastAsia="uk-UA"/>
+        </w:rPr>
+        <w:t>(0;0</w:t>
+      </w:r>
+      <w:r>
+        <w:rPr>
+          <w:rFonts w:ascii="Times New Roman" w:eastAsia="Times New Roman" w:hAnsi="Times New Roman" w:cs="Times New Roman"/>
+          <w:sz w:val="28"/>
+          <w:szCs w:val="28"/>
+          <w:lang w:eastAsia="uk-UA"/>
+        </w:rPr>
+        <w:t>) і вектор зсуву тимчасово нівелюється.</w:t>
+      </w:r>
+    </w:p>
+    <w:p>
+      <w:pPr>
+        <w:spacing w:before="100" w:beforeAutospacing="1" w:after="100" w:afterAutospacing="1" w:line="240" w:lineRule="auto"/>
+        <w:rPr>
+          <w:rFonts w:ascii="Times New Roman" w:eastAsia="Times New Roman" w:hAnsi="Times New Roman" w:cs="Times New Roman"/>
+          <w:sz w:val="28"/>
+          <w:szCs w:val="28"/>
+          <w:lang w:eastAsia="uk-UA"/>
+        </w:rPr>
+      </w:pPr>
+      <w:r>
+        <w:rPr>
+          <w:rFonts w:ascii="Times New Roman" w:eastAsia="Times New Roman" w:hAnsi="Times New Roman" w:cs="Times New Roman"/>
+          <w:noProof/>
+          <w:sz w:val="28"/>
+          <w:szCs w:val="28"/>
+          <w:lang w:eastAsia="uk-UA"/>
+        </w:rPr>
+        <w:drawing>
+          <wp:inline distT="0" distB="0" distL="0" distR="0" wp14:anchorId="49A31F32" wp14:editId="11F0AB31">
+            <wp:extent cx="3400900" cy="590632"/>
+            <wp:effectExtent l="0" t="0" r="9525" b="0"/>
+            <wp:docPr id="30" name="Рисунок 30"/>
+            <wp:cNvGraphicFramePr>
+              <a:graphicFrameLocks xmlns:a="http://schemas.openxmlformats.org/drawingml/2006/main" noChangeAspect="1"/>
+            </wp:cNvGraphicFramePr>
+            <a:graphic xmlns:a="http://schemas.openxmlformats.org/drawingml/2006/main">
+              <a:graphicData uri="http://schemas.openxmlformats.org/drawingml/2006/picture">
+                <pic:pic xmlns:pic="http://schemas.openxmlformats.org/drawingml/2006/picture">
+                  <pic:nvPicPr>
+                    <pic:cNvPr id="1" name=""/>
+                    <pic:cNvPicPr/>
+                  </pic:nvPicPr>
+                  <pic:blipFill>
+                    <a:blip r:embed="rId40"/>
+                    <a:stretch>
+                      <a:fillRect/>
+                    </a:stretch>
+                  </pic:blipFill>
+                  <pic:spPr>
+                    <a:xfrm>
+                      <a:off x="0" y="0"/>
+                      <a:ext cx="3400900" cy="590632"/>
+                    </a:xfrm>
+                    <a:prstGeom prst="rect">
+                      <a:avLst/>
+                    </a:prstGeom>
+                  </pic:spPr>
+                </pic:pic>
+              </a:graphicData>
+            </a:graphic>
+          </wp:inline>
+        </w:drawing>
+      </w:r>
+      <w:r>
+        <w:rPr>
+          <w:rFonts w:ascii="Times New Roman" w:eastAsia="Times New Roman" w:hAnsi="Times New Roman" w:cs="Times New Roman"/>
+          <w:sz w:val="28"/>
+          <w:szCs w:val="28"/>
+          <w:lang w:eastAsia="uk-UA"/>
+        </w:rPr>
+        <w:t>Залишається лише чистий поворот.</w:t>
+      </w:r>
+    </w:p>
+    <w:p>
+      <w:pPr>
+        <w:spacing w:before="100" w:beforeAutospacing="1" w:after="100" w:afterAutospacing="1" w:line="240" w:lineRule="auto"/>
+        <w:rPr>
+          <w:rFonts w:ascii="Times New Roman" w:eastAsia="Times New Roman" w:hAnsi="Times New Roman" w:cs="Times New Roman"/>
+          <w:sz w:val="28"/>
+          <w:szCs w:val="28"/>
+          <w:lang w:eastAsia="uk-UA"/>
+        </w:rPr>
+      </w:pPr>
+      <w:r>
+        <w:rPr>
+          <w:rFonts w:ascii="Times New Roman" w:eastAsia="Times New Roman" w:hAnsi="Times New Roman" w:cs="Times New Roman"/>
+          <w:sz w:val="28"/>
+          <w:szCs w:val="28"/>
+          <w:lang w:eastAsia="uk-UA"/>
+        </w:rPr>
+        <w:t>Далі будується матриця взаємної коваріації.</w:t>
+      </w:r>
+    </w:p>
+    <w:p>
+      <w:pPr>
+        <w:spacing w:before="100" w:beforeAutospacing="1" w:after="100" w:afterAutospacing="1" w:line="240" w:lineRule="auto"/>
+        <w:rPr>
+          <w:rFonts w:ascii="Times New Roman" w:eastAsia="Times New Roman" w:hAnsi="Times New Roman" w:cs="Times New Roman"/>
+          <w:sz w:val="28"/>
+          <w:szCs w:val="28"/>
+          <w:lang w:eastAsia="uk-UA"/>
+        </w:rPr>
+      </w:pPr>
+      <w:r>
+        <w:rPr>
+          <w:rFonts w:ascii="Times New Roman" w:eastAsia="Times New Roman" w:hAnsi="Times New Roman" w:cs="Times New Roman"/>
+          <w:noProof/>
+          <w:sz w:val="28"/>
+          <w:szCs w:val="28"/>
+          <w:lang w:eastAsia="uk-UA"/>
+        </w:rPr>
+        <w:drawing>
+          <wp:inline distT="0" distB="0" distL="0" distR="0" wp14:anchorId="58E42B19" wp14:editId="4456560B">
+            <wp:extent cx="4658375" cy="1105054"/>
+            <wp:effectExtent l="0" t="0" r="8890" b="0"/>
+            <wp:docPr id="31" name="Рисунок 31"/>
+            <wp:cNvGraphicFramePr>
+              <a:graphicFrameLocks xmlns:a="http://schemas.openxmlformats.org/drawingml/2006/main" noChangeAspect="1"/>
+            </wp:cNvGraphicFramePr>
+            <a:graphic xmlns:a="http://schemas.openxmlformats.org/drawingml/2006/main">
+              <a:graphicData uri="http://schemas.openxmlformats.org/drawingml/2006/picture">
+                <pic:pic xmlns:pic="http://schemas.openxmlformats.org/drawingml/2006/picture">
+                  <pic:nvPicPr>
+                    <pic:cNvPr id="1" name=""/>
+                    <pic:cNvPicPr/>
+                  </pic:nvPicPr>
+                  <pic:blipFill>
+                    <a:blip r:embed="rId41"/>
+                    <a:stretch>
+                      <a:fillRect/>
+                    </a:stretch>
+                  </pic:blipFill>
+                  <pic:spPr>
+                    <a:xfrm>
+                      <a:off x="0" y="0"/>
+                      <a:ext cx="4658375" cy="1105054"/>
+                    </a:xfrm>
+                    <a:prstGeom prst="rect">
+                      <a:avLst/>
+                    </a:prstGeom>
+                  </pic:spPr>
+                </pic:pic>
+              </a:graphicData>
+            </a:graphic>
+          </wp:inline>
+        </w:drawing>
+      </w:r>
+    </w:p>
+    <w:p>
+      <w:pPr>
+        <w:spacing w:before="100" w:beforeAutospacing="1" w:after="100" w:afterAutospacing="1" w:line="240" w:lineRule="auto"/>
+        <w:rPr>
+          <w:rFonts w:ascii="Times New Roman" w:eastAsia="Times New Roman" w:hAnsi="Times New Roman" w:cs="Times New Roman"/>
+          <w:sz w:val="28"/>
+          <w:szCs w:val="28"/>
+          <w:lang w:eastAsia="uk-UA"/>
+        </w:rPr>
+      </w:pPr>
+      <w:r>
+        <w:rPr>
+          <w:rFonts w:ascii="Times New Roman" w:eastAsia="Times New Roman" w:hAnsi="Times New Roman" w:cs="Times New Roman"/>
+          <w:sz w:val="28"/>
+          <w:szCs w:val="28"/>
+          <w:lang w:eastAsia="uk-UA"/>
+        </w:rPr>
+        <w:lastRenderedPageBreak/>
+        <w:t>Це матриця 2 на 2.</w:t>
+      </w:r>
+    </w:p>
+    <w:p>
+      <w:pPr>
+        <w:spacing w:before="100" w:beforeAutospacing="1" w:after="100" w:afterAutospacing="1" w:line="240" w:lineRule="auto"/>
+        <w:rPr>
+          <w:rFonts w:ascii="Times New Roman" w:eastAsia="Times New Roman" w:hAnsi="Times New Roman" w:cs="Times New Roman"/>
+          <w:sz w:val="28"/>
+          <w:szCs w:val="28"/>
+          <w:lang w:val="ru-RU" w:eastAsia="uk-UA"/>
+        </w:rPr>
+      </w:pPr>
+      <w:r>
+        <w:rPr>
+          <w:rFonts w:ascii="Times New Roman" w:eastAsia="Times New Roman" w:hAnsi="Times New Roman" w:cs="Times New Roman"/>
+          <w:sz w:val="28"/>
+          <w:szCs w:val="28"/>
+          <w:lang w:eastAsia="uk-UA"/>
+        </w:rPr>
+        <w:t xml:space="preserve">Далі робиться сингулярний розклад матриці </w:t>
+      </w:r>
+      <w:r>
+        <w:rPr>
+          <w:rFonts w:ascii="Times New Roman" w:eastAsia="Times New Roman" w:hAnsi="Times New Roman" w:cs="Times New Roman"/>
+          <w:sz w:val="28"/>
+          <w:szCs w:val="28"/>
+          <w:lang w:val="en-US" w:eastAsia="uk-UA"/>
+        </w:rPr>
+        <w:t>H</w:t>
+      </w:r>
+      <w:r>
+        <w:rPr>
+          <w:rFonts w:ascii="Times New Roman" w:eastAsia="Times New Roman" w:hAnsi="Times New Roman" w:cs="Times New Roman"/>
+          <w:sz w:val="28"/>
+          <w:szCs w:val="28"/>
+          <w:lang w:val="ru-RU" w:eastAsia="uk-UA"/>
+        </w:rPr>
+        <w:t>.</w:t>
+      </w:r>
+    </w:p>
+    <w:p>
+      <w:pPr>
+        <w:spacing w:before="100" w:beforeAutospacing="1" w:after="100" w:afterAutospacing="1" w:line="240" w:lineRule="auto"/>
+        <w:rPr>
+          <w:rFonts w:ascii="Times New Roman" w:eastAsia="Times New Roman" w:hAnsi="Times New Roman" w:cs="Times New Roman"/>
+          <w:sz w:val="28"/>
+          <w:szCs w:val="28"/>
+          <w:lang w:val="ru-RU" w:eastAsia="uk-UA"/>
+        </w:rPr>
+      </w:pPr>
+      <w:r>
+        <w:rPr>
+          <w:rFonts w:ascii="Times New Roman" w:eastAsia="Times New Roman" w:hAnsi="Times New Roman" w:cs="Times New Roman"/>
+          <w:noProof/>
+          <w:sz w:val="28"/>
+          <w:szCs w:val="28"/>
+          <w:lang w:eastAsia="uk-UA"/>
+        </w:rPr>
+        <w:drawing>
+          <wp:inline distT="0" distB="0" distL="0" distR="0" wp14:anchorId="3F2FB66B" wp14:editId="2475F938">
+            <wp:extent cx="1581371" cy="523948"/>
+            <wp:effectExtent l="0" t="0" r="0" b="9525"/>
+            <wp:docPr id="32" name="Рисунок 32"/>
+            <wp:cNvGraphicFramePr>
+              <a:graphicFrameLocks xmlns:a="http://schemas.openxmlformats.org/drawingml/2006/main" noChangeAspect="1"/>
+            </wp:cNvGraphicFramePr>
+            <a:graphic xmlns:a="http://schemas.openxmlformats.org/drawingml/2006/main">
+              <a:graphicData uri="http://schemas.openxmlformats.org/drawingml/2006/picture">
+                <pic:pic xmlns:pic="http://schemas.openxmlformats.org/drawingml/2006/picture">
+                  <pic:nvPicPr>
+                    <pic:cNvPr id="1" name=""/>
+                    <pic:cNvPicPr/>
+                  </pic:nvPicPr>
+                  <pic:blipFill>
+                    <a:blip r:embed="rId42"/>
+                    <a:stretch>
+                      <a:fillRect/>
+                    </a:stretch>
+                  </pic:blipFill>
+                  <pic:spPr>
+                    <a:xfrm>
+                      <a:off x="0" y="0"/>
                       <a:ext cx="1581371" cy="523948"/>
                     </a:xfrm>
                     <a:prstGeom prst="rect">
@@ -12785,7 +13238,6 @@
           <w:szCs w:val="28"/>
           <w:lang w:val="en-US" w:eastAsia="uk-UA"/>
         </w:rPr>
-        <w:lastRenderedPageBreak/>
         <w:t>U</w:t>
       </w:r>
       <w:r>
@@ -12925,7 +13377,7 @@
           <w:lang w:eastAsia="uk-UA"/>
         </w:rPr>
         <w:drawing>
-          <wp:inline distT="0" distB="0" distL="0" distR="0" wp14:anchorId="0CB44BDD" wp14:editId="53E7E1CF">
+          <wp:inline distT="0" distB="0" distL="0" distR="0" wp14:anchorId="5CE6A4B8" wp14:editId="174A1CB5">
             <wp:extent cx="1295581" cy="457264"/>
             <wp:effectExtent l="0" t="0" r="0" b="0"/>
             <wp:docPr id="33" name="Рисунок 33"/>
@@ -12940,7 +13392,7 @@
                     <pic:cNvPicPr/>
                   </pic:nvPicPr>
                   <pic:blipFill>
-                    <a:blip r:embed="rId36"/>
+                    <a:blip r:embed="rId43"/>
                     <a:stretch>
                       <a:fillRect/>
                     </a:stretch>
@@ -13000,7 +13452,7 @@
           <w:lang w:eastAsia="uk-UA"/>
         </w:rPr>
         <w:drawing>
-          <wp:inline distT="0" distB="0" distL="0" distR="0" wp14:anchorId="7B7FFFDD" wp14:editId="0C21FE0F">
+          <wp:inline distT="0" distB="0" distL="0" distR="0" wp14:anchorId="113C1AE2" wp14:editId="49DFFC62">
             <wp:extent cx="1695687" cy="476316"/>
             <wp:effectExtent l="0" t="0" r="0" b="0"/>
             <wp:docPr id="34" name="Рисунок 34"/>
@@ -13015,7 +13467,7 @@
                     <pic:cNvPicPr/>
                   </pic:nvPicPr>
                   <pic:blipFill>
-                    <a:blip r:embed="rId37"/>
+                    <a:blip r:embed="rId44"/>
                     <a:stretch>
                       <a:fillRect/>
                     </a:stretch>
@@ -13075,7 +13527,7 @@
           <w:lang w:eastAsia="uk-UA"/>
         </w:rPr>
         <w:drawing>
-          <wp:inline distT="0" distB="0" distL="0" distR="0" wp14:anchorId="3851FBEC" wp14:editId="27E8594B">
+          <wp:inline distT="0" distB="0" distL="0" distR="0" wp14:anchorId="30E222DB" wp14:editId="6E5FEA92">
             <wp:extent cx="1810003" cy="676369"/>
             <wp:effectExtent l="0" t="0" r="0" b="0"/>
             <wp:docPr id="35" name="Рисунок 35"/>
@@ -13090,7 +13542,7 @@
                     <pic:cNvPicPr/>
                   </pic:nvPicPr>
                   <pic:blipFill>
-                    <a:blip r:embed="rId38"/>
+                    <a:blip r:embed="rId45"/>
                     <a:stretch>
                       <a:fillRect/>
                     </a:stretch>
@@ -13130,7 +13582,7 @@
           <w:lang w:eastAsia="uk-UA"/>
         </w:rPr>
         <w:drawing>
-          <wp:inline distT="0" distB="0" distL="0" distR="0" wp14:anchorId="7754D0E9" wp14:editId="14A8C4A9">
+          <wp:inline distT="0" distB="0" distL="0" distR="0" wp14:anchorId="70B6DA06" wp14:editId="31D7031B">
             <wp:extent cx="1390844" cy="809738"/>
             <wp:effectExtent l="0" t="0" r="0" b="9525"/>
             <wp:docPr id="36" name="Рисунок 36"/>
@@ -13145,7 +13597,7 @@
                     <pic:cNvPicPr/>
                   </pic:nvPicPr>
                   <pic:blipFill>
-                    <a:blip r:embed="rId39"/>
+                    <a:blip r:embed="rId46"/>
                     <a:stretch>
                       <a:fillRect/>
                     </a:stretch>
@@ -13185,7 +13637,7 @@
           <w:lang w:eastAsia="uk-UA"/>
         </w:rPr>
         <w:drawing>
-          <wp:inline distT="0" distB="0" distL="0" distR="0" wp14:anchorId="79A72210" wp14:editId="7EE3ADC8">
+          <wp:inline distT="0" distB="0" distL="0" distR="0" wp14:anchorId="209EDE14" wp14:editId="09BA72BF">
             <wp:extent cx="3410426" cy="762106"/>
             <wp:effectExtent l="0" t="0" r="0" b="0"/>
             <wp:docPr id="37" name="Рисунок 37"/>
@@ -13200,7 +13652,7 @@
                     <pic:cNvPicPr/>
                   </pic:nvPicPr>
                   <pic:blipFill>
-                    <a:blip r:embed="rId40"/>
+                    <a:blip r:embed="rId47"/>
                     <a:stretch>
                       <a:fillRect/>
                     </a:stretch>
@@ -13260,7 +13712,7 @@
           <w:lang w:eastAsia="uk-UA"/>
         </w:rPr>
         <w:drawing>
-          <wp:inline distT="0" distB="0" distL="0" distR="0" wp14:anchorId="2665F99A" wp14:editId="7FE4665D">
+          <wp:inline distT="0" distB="0" distL="0" distR="0" wp14:anchorId="50D0B5D2" wp14:editId="71DC081C">
             <wp:extent cx="3410426" cy="762106"/>
             <wp:effectExtent l="0" t="0" r="0" b="0"/>
             <wp:docPr id="38" name="Рисунок 38"/>
@@ -13275,7 +13727,7 @@
                     <pic:cNvPicPr/>
                   </pic:nvPicPr>
                   <pic:blipFill>
-                    <a:blip r:embed="rId40"/>
+                    <a:blip r:embed="rId47"/>
                     <a:stretch>
                       <a:fillRect/>
                     </a:stretch>
@@ -13546,6 +13998,16 @@
           <w:lang w:eastAsia="uk-UA"/>
         </w:rPr>
         <w:br/>
+      </w:r>
+      <w:r>
+        <w:rPr>
+          <w:rFonts w:ascii="Courier New" w:eastAsia="Times New Roman" w:hAnsi="Courier New" w:cs="Courier New"/>
+          <w:color w:val="A9B7C6"/>
+          <w:sz w:val="20"/>
+          <w:szCs w:val="20"/>
+          <w:lang w:eastAsia="uk-UA"/>
+        </w:rPr>
+        <w:lastRenderedPageBreak/>
         <w:t xml:space="preserve">    </w:t>
       </w:r>
       <w:r>
@@ -13953,16 +14415,6 @@
           <w:lang w:eastAsia="uk-UA"/>
         </w:rPr>
         <w:br/>
-      </w:r>
-      <w:r>
-        <w:rPr>
-          <w:rFonts w:ascii="Courier New" w:eastAsia="Times New Roman" w:hAnsi="Courier New" w:cs="Courier New"/>
-          <w:color w:val="A9B7C6"/>
-          <w:sz w:val="20"/>
-          <w:szCs w:val="20"/>
-          <w:lang w:eastAsia="uk-UA"/>
-        </w:rPr>
-        <w:lastRenderedPageBreak/>
         <w:t xml:space="preserve">        source_sample = points1[indices]</w:t>
       </w:r>
       <w:r>
@@ -14636,7 +15088,7 @@
     </w:p>
     <w:p>
       <w:pPr>
-        <w:pStyle w:val="HTML"/>
+        <w:pStyle w:val="HTMLPreformatted"/>
         <w:shd w:val="clear" w:color="auto" w:fill="1E1F22"/>
         <w:rPr>
           <w:color w:val="A9B7C6"/>
@@ -14683,7 +15135,7 @@
     </w:p>
     <w:p>
       <w:pPr>
-        <w:pStyle w:val="HTML"/>
+        <w:pStyle w:val="HTMLPreformatted"/>
         <w:shd w:val="clear" w:color="auto" w:fill="1E1F22"/>
         <w:rPr>
           <w:color w:val="A9B7C6"/>
@@ -14735,7 +15187,7 @@
           <w:lang w:eastAsia="uk-UA"/>
         </w:rPr>
         <w:drawing>
-          <wp:inline distT="0" distB="0" distL="0" distR="0" wp14:anchorId="38497559" wp14:editId="0E65DAED">
+          <wp:inline distT="0" distB="0" distL="0" distR="0" wp14:anchorId="21301DAC" wp14:editId="4DEF20EE">
             <wp:extent cx="1657581" cy="438211"/>
             <wp:effectExtent l="0" t="0" r="0" b="0"/>
             <wp:docPr id="39" name="Рисунок 39"/>
@@ -14750,7 +15202,7 @@
                     <pic:cNvPicPr/>
                   </pic:nvPicPr>
                   <pic:blipFill>
-                    <a:blip r:embed="rId41"/>
+                    <a:blip r:embed="rId48"/>
                     <a:stretch>
                       <a:fillRect/>
                     </a:stretch>
@@ -14799,7 +15251,7 @@
           <w:lang w:eastAsia="uk-UA"/>
         </w:rPr>
         <w:drawing>
-          <wp:inline distT="0" distB="0" distL="0" distR="0" wp14:anchorId="3F3CFB08" wp14:editId="5CE571EC">
+          <wp:inline distT="0" distB="0" distL="0" distR="0" wp14:anchorId="69CF354E" wp14:editId="4D3CF249">
             <wp:extent cx="4629796" cy="543001"/>
             <wp:effectExtent l="0" t="0" r="0" b="9525"/>
             <wp:docPr id="40" name="Рисунок 40"/>
@@ -14814,7 +15266,7 @@
                     <pic:cNvPicPr/>
                   </pic:nvPicPr>
                   <pic:blipFill>
-                    <a:blip r:embed="rId42"/>
+                    <a:blip r:embed="rId49"/>
                     <a:stretch>
                       <a:fillRect/>
                     </a:stretch>
@@ -14861,6 +15313,7 @@
           <w:szCs w:val="28"/>
           <w:lang w:eastAsia="uk-UA"/>
         </w:rPr>
+        <w:lastRenderedPageBreak/>
         <w:t xml:space="preserve"> В кінці після вибору оптимальних інлаєрів ми будуємо фінальну матрицю через </w:t>
       </w:r>
       <w:r>
@@ -14893,7 +15346,7 @@
     </w:p>
     <w:p>
       <w:pPr>
-        <w:pStyle w:val="HTML"/>
+        <w:pStyle w:val="HTMLPreformatted"/>
         <w:shd w:val="clear" w:color="auto" w:fill="1E1F22"/>
         <w:rPr>
           <w:color w:val="A9B7C6"/>
@@ -14967,7 +15420,6 @@
           <w:szCs w:val="28"/>
           <w:lang w:eastAsia="uk-UA"/>
         </w:rPr>
-        <w:lastRenderedPageBreak/>
         <w:t>Далі ми маємо прописати функцію, яка розпаковує афінну матрицю.</w:t>
       </w:r>
     </w:p>
@@ -15010,7 +15462,7 @@
           <w:lang w:eastAsia="uk-UA"/>
         </w:rPr>
         <w:drawing>
-          <wp:inline distT="0" distB="0" distL="0" distR="0" wp14:anchorId="6EC6FA8C" wp14:editId="6EB4191C">
+          <wp:inline distT="0" distB="0" distL="0" distR="0" wp14:anchorId="3627CB83" wp14:editId="2FB73722">
             <wp:extent cx="6120765" cy="770890"/>
             <wp:effectExtent l="0" t="0" r="0" b="0"/>
             <wp:docPr id="41" name="Рисунок 41"/>
@@ -15025,7 +15477,7 @@
                     <pic:cNvPicPr/>
                   </pic:nvPicPr>
                   <pic:blipFill>
-                    <a:blip r:embed="rId43"/>
+                    <a:blip r:embed="rId50"/>
                     <a:stretch>
                       <a:fillRect/>
                     </a:stretch>
@@ -15113,7 +15565,7 @@
           <w:lang w:eastAsia="uk-UA"/>
         </w:rPr>
         <w:drawing>
-          <wp:inline distT="0" distB="0" distL="0" distR="0" wp14:anchorId="350DCE79" wp14:editId="25748B52">
+          <wp:inline distT="0" distB="0" distL="0" distR="0" wp14:anchorId="22CAE553" wp14:editId="5CCC700D">
             <wp:extent cx="1238423" cy="409632"/>
             <wp:effectExtent l="0" t="0" r="0" b="9525"/>
             <wp:docPr id="42" name="Рисунок 42"/>
@@ -15128,7 +15580,7 @@
                     <pic:cNvPicPr/>
                   </pic:nvPicPr>
                   <pic:blipFill>
-                    <a:blip r:embed="rId44"/>
+                    <a:blip r:embed="rId51"/>
                     <a:stretch>
                       <a:fillRect/>
                     </a:stretch>
@@ -15177,7 +15629,7 @@
           <w:lang w:eastAsia="uk-UA"/>
         </w:rPr>
         <w:drawing>
-          <wp:inline distT="0" distB="0" distL="0" distR="0" wp14:anchorId="19D1DD98" wp14:editId="450E56D0">
+          <wp:inline distT="0" distB="0" distL="0" distR="0" wp14:anchorId="29F386D4" wp14:editId="7E884043">
             <wp:extent cx="6120765" cy="1405890"/>
             <wp:effectExtent l="0" t="0" r="0" b="3810"/>
             <wp:docPr id="43" name="Рисунок 43"/>
@@ -15192,7 +15644,7 @@
                     <pic:cNvPicPr/>
                   </pic:nvPicPr>
                   <pic:blipFill>
-                    <a:blip r:embed="rId45"/>
+                    <a:blip r:embed="rId52"/>
                     <a:stretch>
                       <a:fillRect/>
                     </a:stretch>
@@ -15230,12 +15682,289 @@
           <w:szCs w:val="28"/>
           <w:lang w:eastAsia="uk-UA"/>
         </w:rPr>
-        <w:t>Всі потрібні рохраховані параметри повертаються для подальшого порівняння та знаходження похибок.</w:t>
+        <w:t>В випадку, якщо використовувався коефіцієнт масштабування (тобто він не дорівнював 1.0), то спочатку треба знайти його.</w:t>
       </w:r>
     </w:p>
     <w:p>
       <w:pPr>
-        <w:pStyle w:val="HTML"/>
+        <w:spacing w:before="100" w:beforeAutospacing="1" w:after="100" w:afterAutospacing="1" w:line="240" w:lineRule="auto"/>
+        <w:rPr>
+          <w:rFonts w:ascii="Times New Roman" w:eastAsia="Times New Roman" w:hAnsi="Times New Roman" w:cs="Times New Roman"/>
+          <w:sz w:val="28"/>
+          <w:szCs w:val="28"/>
+          <w:lang w:eastAsia="uk-UA"/>
+        </w:rPr>
+      </w:pPr>
+      <w:r>
+        <w:rPr>
+          <w:rFonts w:ascii="Times New Roman" w:eastAsia="Times New Roman" w:hAnsi="Times New Roman" w:cs="Times New Roman"/>
+          <w:sz w:val="28"/>
+          <w:szCs w:val="28"/>
+          <w:lang w:eastAsia="uk-UA"/>
+        </w:rPr>
+        <w:drawing>
+          <wp:inline distT="0" distB="0" distL="0" distR="0" wp14:anchorId="37ABF9A7" wp14:editId="5B953E5A">
+            <wp:extent cx="1924319" cy="704948"/>
+            <wp:effectExtent l="0" t="0" r="0" b="0"/>
+            <wp:docPr id="443279008" name="Picture 1"/>
+            <wp:cNvGraphicFramePr>
+              <a:graphicFrameLocks xmlns:a="http://schemas.openxmlformats.org/drawingml/2006/main" noChangeAspect="1"/>
+            </wp:cNvGraphicFramePr>
+            <a:graphic xmlns:a="http://schemas.openxmlformats.org/drawingml/2006/main">
+              <a:graphicData uri="http://schemas.openxmlformats.org/drawingml/2006/picture">
+                <pic:pic xmlns:pic="http://schemas.openxmlformats.org/drawingml/2006/picture">
+                  <pic:nvPicPr>
+                    <pic:cNvPr id="443279008" name=""/>
+                    <pic:cNvPicPr/>
+                  </pic:nvPicPr>
+                  <pic:blipFill>
+                    <a:blip r:embed="rId53"/>
+                    <a:stretch>
+                      <a:fillRect/>
+                    </a:stretch>
+                  </pic:blipFill>
+                  <pic:spPr>
+                    <a:xfrm>
+                      <a:off x="0" y="0"/>
+                      <a:ext cx="1924319" cy="704948"/>
+                    </a:xfrm>
+                    <a:prstGeom prst="rect">
+                      <a:avLst/>
+                    </a:prstGeom>
+                  </pic:spPr>
+                </pic:pic>
+              </a:graphicData>
+            </a:graphic>
+          </wp:inline>
+        </w:drawing>
+      </w:r>
+    </w:p>
+    <w:p>
+      <w:pPr>
+        <w:spacing w:before="100" w:beforeAutospacing="1" w:after="100" w:afterAutospacing="1" w:line="240" w:lineRule="auto"/>
+        <w:rPr>
+          <w:rFonts w:ascii="Times New Roman" w:eastAsia="Times New Roman" w:hAnsi="Times New Roman" w:cs="Times New Roman"/>
+          <w:sz w:val="28"/>
+          <w:szCs w:val="28"/>
+          <w:lang w:eastAsia="uk-UA"/>
+        </w:rPr>
+      </w:pPr>
+      <w:r>
+        <w:rPr>
+          <w:rFonts w:ascii="Times New Roman" w:eastAsia="Times New Roman" w:hAnsi="Times New Roman" w:cs="Times New Roman"/>
+          <w:sz w:val="28"/>
+          <w:szCs w:val="28"/>
+          <w:lang w:eastAsia="uk-UA"/>
+        </w:rPr>
+        <w:drawing>
+          <wp:inline distT="0" distB="0" distL="0" distR="0" wp14:anchorId="626A763E" wp14:editId="2947153F">
+            <wp:extent cx="6011114" cy="476316"/>
+            <wp:effectExtent l="0" t="0" r="8890" b="0"/>
+            <wp:docPr id="53130251" name="Picture 1"/>
+            <wp:cNvGraphicFramePr>
+              <a:graphicFrameLocks xmlns:a="http://schemas.openxmlformats.org/drawingml/2006/main" noChangeAspect="1"/>
+            </wp:cNvGraphicFramePr>
+            <a:graphic xmlns:a="http://schemas.openxmlformats.org/drawingml/2006/main">
+              <a:graphicData uri="http://schemas.openxmlformats.org/drawingml/2006/picture">
+                <pic:pic xmlns:pic="http://schemas.openxmlformats.org/drawingml/2006/picture">
+                  <pic:nvPicPr>
+                    <pic:cNvPr id="53130251" name=""/>
+                    <pic:cNvPicPr/>
+                  </pic:nvPicPr>
+                  <pic:blipFill>
+                    <a:blip r:embed="rId54"/>
+                    <a:stretch>
+                      <a:fillRect/>
+                    </a:stretch>
+                  </pic:blipFill>
+                  <pic:spPr>
+                    <a:xfrm>
+                      <a:off x="0" y="0"/>
+                      <a:ext cx="6011114" cy="476316"/>
+                    </a:xfrm>
+                    <a:prstGeom prst="rect">
+                      <a:avLst/>
+                    </a:prstGeom>
+                  </pic:spPr>
+                </pic:pic>
+              </a:graphicData>
+            </a:graphic>
+          </wp:inline>
+        </w:drawing>
+      </w:r>
+    </w:p>
+    <w:p>
+      <w:pPr>
+        <w:spacing w:before="100" w:beforeAutospacing="1" w:after="100" w:afterAutospacing="1" w:line="240" w:lineRule="auto"/>
+        <w:rPr>
+          <w:rFonts w:ascii="Times New Roman" w:eastAsia="Times New Roman" w:hAnsi="Times New Roman" w:cs="Times New Roman"/>
+          <w:sz w:val="28"/>
+          <w:szCs w:val="28"/>
+          <w:lang w:eastAsia="uk-UA"/>
+        </w:rPr>
+      </w:pPr>
+      <w:r>
+        <w:rPr>
+          <w:rFonts w:ascii="Times New Roman" w:eastAsia="Times New Roman" w:hAnsi="Times New Roman" w:cs="Times New Roman"/>
+          <w:sz w:val="28"/>
+          <w:szCs w:val="28"/>
+          <w:lang w:eastAsia="uk-UA"/>
+        </w:rPr>
+        <w:drawing>
+          <wp:inline distT="0" distB="0" distL="0" distR="0" wp14:anchorId="688A4DBE" wp14:editId="1CD55ADA">
+            <wp:extent cx="1914792" cy="552527"/>
+            <wp:effectExtent l="0" t="0" r="9525" b="0"/>
+            <wp:docPr id="426834908" name="Picture 1"/>
+            <wp:cNvGraphicFramePr>
+              <a:graphicFrameLocks xmlns:a="http://schemas.openxmlformats.org/drawingml/2006/main" noChangeAspect="1"/>
+            </wp:cNvGraphicFramePr>
+            <a:graphic xmlns:a="http://schemas.openxmlformats.org/drawingml/2006/main">
+              <a:graphicData uri="http://schemas.openxmlformats.org/drawingml/2006/picture">
+                <pic:pic xmlns:pic="http://schemas.openxmlformats.org/drawingml/2006/picture">
+                  <pic:nvPicPr>
+                    <pic:cNvPr id="426834908" name=""/>
+                    <pic:cNvPicPr/>
+                  </pic:nvPicPr>
+                  <pic:blipFill>
+                    <a:blip r:embed="rId55"/>
+                    <a:stretch>
+                      <a:fillRect/>
+                    </a:stretch>
+                  </pic:blipFill>
+                  <pic:spPr>
+                    <a:xfrm>
+                      <a:off x="0" y="0"/>
+                      <a:ext cx="1914792" cy="552527"/>
+                    </a:xfrm>
+                    <a:prstGeom prst="rect">
+                      <a:avLst/>
+                    </a:prstGeom>
+                  </pic:spPr>
+                </pic:pic>
+              </a:graphicData>
+            </a:graphic>
+          </wp:inline>
+        </w:drawing>
+      </w:r>
+    </w:p>
+    <w:p>
+      <w:pPr>
+        <w:spacing w:before="100" w:beforeAutospacing="1" w:after="100" w:afterAutospacing="1" w:line="240" w:lineRule="auto"/>
+        <w:rPr>
+          <w:rFonts w:ascii="Times New Roman" w:eastAsia="Times New Roman" w:hAnsi="Times New Roman" w:cs="Times New Roman"/>
+          <w:sz w:val="28"/>
+          <w:szCs w:val="28"/>
+          <w:lang w:eastAsia="uk-UA"/>
+        </w:rPr>
+      </w:pPr>
+      <w:r>
+        <w:rPr>
+          <w:rFonts w:ascii="Times New Roman" w:eastAsia="Times New Roman" w:hAnsi="Times New Roman" w:cs="Times New Roman"/>
+          <w:sz w:val="28"/>
+          <w:szCs w:val="28"/>
+          <w:lang w:eastAsia="uk-UA"/>
+        </w:rPr>
+        <w:t>Формула кута повороту аналогічна.</w:t>
+      </w:r>
+    </w:p>
+    <w:p>
+      <w:pPr>
+        <w:spacing w:before="100" w:beforeAutospacing="1" w:after="100" w:afterAutospacing="1" w:line="240" w:lineRule="auto"/>
+        <w:rPr>
+          <w:rFonts w:ascii="Times New Roman" w:eastAsia="Times New Roman" w:hAnsi="Times New Roman" w:cs="Times New Roman"/>
+          <w:sz w:val="28"/>
+          <w:szCs w:val="28"/>
+          <w:lang w:eastAsia="uk-UA"/>
+        </w:rPr>
+      </w:pPr>
+      <w:r>
+        <w:rPr>
+          <w:rFonts w:ascii="Times New Roman" w:eastAsia="Times New Roman" w:hAnsi="Times New Roman" w:cs="Times New Roman"/>
+          <w:sz w:val="28"/>
+          <w:szCs w:val="28"/>
+          <w:lang w:eastAsia="uk-UA"/>
+        </w:rPr>
+        <w:lastRenderedPageBreak/>
+        <w:drawing>
+          <wp:inline distT="0" distB="0" distL="0" distR="0" wp14:anchorId="1CA09E57" wp14:editId="58E728C6">
+            <wp:extent cx="2200582" cy="752580"/>
+            <wp:effectExtent l="0" t="0" r="9525" b="9525"/>
+            <wp:docPr id="1143680064" name="Picture 1"/>
+            <wp:cNvGraphicFramePr>
+              <a:graphicFrameLocks xmlns:a="http://schemas.openxmlformats.org/drawingml/2006/main" noChangeAspect="1"/>
+            </wp:cNvGraphicFramePr>
+            <a:graphic xmlns:a="http://schemas.openxmlformats.org/drawingml/2006/main">
+              <a:graphicData uri="http://schemas.openxmlformats.org/drawingml/2006/picture">
+                <pic:pic xmlns:pic="http://schemas.openxmlformats.org/drawingml/2006/picture">
+                  <pic:nvPicPr>
+                    <pic:cNvPr id="1143680064" name=""/>
+                    <pic:cNvPicPr/>
+                  </pic:nvPicPr>
+                  <pic:blipFill>
+                    <a:blip r:embed="rId56"/>
+                    <a:stretch>
+                      <a:fillRect/>
+                    </a:stretch>
+                  </pic:blipFill>
+                  <pic:spPr>
+                    <a:xfrm>
+                      <a:off x="0" y="0"/>
+                      <a:ext cx="2200582" cy="752580"/>
+                    </a:xfrm>
+                    <a:prstGeom prst="rect">
+                      <a:avLst/>
+                    </a:prstGeom>
+                  </pic:spPr>
+                </pic:pic>
+              </a:graphicData>
+            </a:graphic>
+          </wp:inline>
+        </w:drawing>
+      </w:r>
+    </w:p>
+    <w:p>
+      <w:pPr>
+        <w:spacing w:before="100" w:beforeAutospacing="1" w:after="100" w:afterAutospacing="1" w:line="240" w:lineRule="auto"/>
+        <w:rPr>
+          <w:rFonts w:ascii="Times New Roman" w:eastAsia="Times New Roman" w:hAnsi="Times New Roman" w:cs="Times New Roman"/>
+          <w:sz w:val="28"/>
+          <w:szCs w:val="28"/>
+          <w:lang w:eastAsia="uk-UA"/>
+        </w:rPr>
+      </w:pPr>
+      <w:r>
+        <w:rPr>
+          <w:rFonts w:ascii="Times New Roman" w:eastAsia="Times New Roman" w:hAnsi="Times New Roman" w:cs="Times New Roman"/>
+          <w:sz w:val="28"/>
+          <w:szCs w:val="28"/>
+          <w:lang w:eastAsia="uk-UA"/>
+        </w:rPr>
+        <w:t>Всі інші обчислення виконуються теж так само, як в попередній функції.</w:t>
+      </w:r>
+    </w:p>
+    <w:p>
+      <w:pPr>
+        <w:spacing w:before="100" w:beforeAutospacing="1" w:after="100" w:afterAutospacing="1" w:line="240" w:lineRule="auto"/>
+        <w:rPr>
+          <w:rFonts w:ascii="Times New Roman" w:eastAsia="Times New Roman" w:hAnsi="Times New Roman" w:cs="Times New Roman"/>
+          <w:sz w:val="28"/>
+          <w:szCs w:val="28"/>
+          <w:lang w:eastAsia="uk-UA"/>
+        </w:rPr>
+      </w:pPr>
+      <w:r>
+        <w:rPr>
+          <w:rFonts w:ascii="Times New Roman" w:eastAsia="Times New Roman" w:hAnsi="Times New Roman" w:cs="Times New Roman"/>
+          <w:sz w:val="28"/>
+          <w:szCs w:val="28"/>
+          <w:lang w:eastAsia="uk-UA"/>
+        </w:rPr>
+        <w:t>Всі потрібні рохраховані параметри повертаються для подальшого порівняння та знаходження похибок.</w:t>
+      </w:r>
+    </w:p>
+    <w:p>
+      <w:pPr>
+        <w:pStyle w:val="HTMLPreformatted"/>
         <w:shd w:val="clear" w:color="auto" w:fill="1E1F22"/>
         <w:rPr>
           <w:color w:val="A9B7C6"/>
@@ -15640,6 +16369,15 @@
         </w:rPr>
         <w:t>est_dy</w:t>
       </w:r>
+    </w:p>
+    <w:p>
+      <w:pPr>
+        <w:pStyle w:val="HTMLPreformatted"/>
+        <w:shd w:val="clear" w:color="auto" w:fill="1E1F22"/>
+        <w:rPr>
+          <w:color w:val="A9B7C6"/>
+        </w:rPr>
+      </w:pPr>
     </w:p>
     <w:p>
       <w:pPr>
@@ -16276,16 +17014,6 @@
           <w:lang w:eastAsia="uk-UA"/>
         </w:rPr>
         <w:br/>
-      </w:r>
-      <w:r>
-        <w:rPr>
-          <w:rFonts w:ascii="Courier New" w:eastAsia="Times New Roman" w:hAnsi="Courier New" w:cs="Courier New"/>
-          <w:color w:val="A9B7C6"/>
-          <w:sz w:val="20"/>
-          <w:szCs w:val="20"/>
-          <w:lang w:eastAsia="uk-UA"/>
-        </w:rPr>
-        <w:lastRenderedPageBreak/>
         <w:t xml:space="preserve">    )</w:t>
       </w:r>
       <w:r>
@@ -17140,6 +17868,16 @@
           <w:lang w:eastAsia="uk-UA"/>
         </w:rPr>
         <w:br/>
+      </w:r>
+      <w:r>
+        <w:rPr>
+          <w:rFonts w:ascii="Courier New" w:eastAsia="Times New Roman" w:hAnsi="Courier New" w:cs="Courier New"/>
+          <w:color w:val="CC7832"/>
+          <w:sz w:val="20"/>
+          <w:szCs w:val="20"/>
+          <w:lang w:eastAsia="uk-UA"/>
+        </w:rPr>
+        <w:lastRenderedPageBreak/>
         <w:t xml:space="preserve">    </w:t>
       </w:r>
       <w:r>
@@ -19227,7 +19965,6 @@
           <w:szCs w:val="20"/>
           <w:lang w:eastAsia="uk-UA"/>
         </w:rPr>
-        <w:lastRenderedPageBreak/>
         <w:br/>
         <w:t xml:space="preserve">        </w:t>
       </w:r>
@@ -20268,12 +21005,14 @@
         <w:rPr>
           <w:rFonts w:ascii="Times New Roman" w:eastAsia="Times New Roman" w:hAnsi="Times New Roman" w:cs="Times New Roman"/>
           <w:b/>
-          <w:sz w:val="28"/>
-          <w:szCs w:val="28"/>
-          <w:lang w:eastAsia="uk-UA"/>
-        </w:rPr>
+          <w:noProof/>
+          <w:sz w:val="28"/>
+          <w:szCs w:val="28"/>
+          <w:lang w:eastAsia="uk-UA"/>
+        </w:rPr>
+        <w:lastRenderedPageBreak/>
         <w:drawing>
-          <wp:inline distT="0" distB="0" distL="0" distR="0" wp14:anchorId="7895B982" wp14:editId="0384ACB0">
+          <wp:inline distT="0" distB="0" distL="0" distR="0" wp14:anchorId="4C1654F5" wp14:editId="0FC61658">
             <wp:extent cx="6120765" cy="3060700"/>
             <wp:effectExtent l="0" t="0" r="0" b="6350"/>
             <wp:docPr id="44" name="Рисунок 44"/>
@@ -20288,7 +21027,7 @@
                     <pic:cNvPicPr/>
                   </pic:nvPicPr>
                   <pic:blipFill>
-                    <a:blip r:embed="rId46"/>
+                    <a:blip r:embed="rId57"/>
                     <a:stretch>
                       <a:fillRect/>
                     </a:stretch>
@@ -20324,12 +21063,13 @@
         <w:rPr>
           <w:rFonts w:ascii="Times New Roman" w:eastAsia="Times New Roman" w:hAnsi="Times New Roman" w:cs="Times New Roman"/>
           <w:b/>
+          <w:noProof/>
           <w:sz w:val="28"/>
           <w:szCs w:val="28"/>
           <w:lang w:eastAsia="uk-UA"/>
         </w:rPr>
         <w:drawing>
-          <wp:inline distT="0" distB="0" distL="0" distR="0" wp14:anchorId="007A3F83" wp14:editId="41FDD5DB">
+          <wp:inline distT="0" distB="0" distL="0" distR="0" wp14:anchorId="3D53F18E" wp14:editId="5866A848">
             <wp:extent cx="5839640" cy="3086531"/>
             <wp:effectExtent l="0" t="0" r="8890" b="0"/>
             <wp:docPr id="45" name="Рисунок 45"/>
@@ -20344,7 +21084,7 @@
                     <pic:cNvPicPr/>
                   </pic:nvPicPr>
                   <pic:blipFill>
-                    <a:blip r:embed="rId47"/>
+                    <a:blip r:embed="rId58"/>
                     <a:stretch>
                       <a:fillRect/>
                     </a:stretch>
@@ -20443,13 +21183,14 @@
       <w:r>
         <w:rPr>
           <w:rFonts w:ascii="Times New Roman" w:eastAsia="Times New Roman" w:hAnsi="Times New Roman" w:cs="Times New Roman"/>
+          <w:noProof/>
           <w:sz w:val="28"/>
           <w:szCs w:val="28"/>
           <w:lang w:eastAsia="uk-UA"/>
         </w:rPr>
         <w:lastRenderedPageBreak/>
         <w:drawing>
-          <wp:inline distT="0" distB="0" distL="0" distR="0" wp14:anchorId="5FDF3150" wp14:editId="02CBDFDF">
+          <wp:inline distT="0" distB="0" distL="0" distR="0" wp14:anchorId="7552A7DF" wp14:editId="7EFF0E6B">
             <wp:extent cx="6120765" cy="3060700"/>
             <wp:effectExtent l="0" t="0" r="0" b="6350"/>
             <wp:docPr id="46" name="Рисунок 46"/>
@@ -20464,7 +21205,7 @@
                     <pic:cNvPicPr/>
                   </pic:nvPicPr>
                   <pic:blipFill>
-                    <a:blip r:embed="rId48"/>
+                    <a:blip r:embed="rId59"/>
                     <a:stretch>
                       <a:fillRect/>
                     </a:stretch>
@@ -20498,12 +21239,13 @@
       <w:r>
         <w:rPr>
           <w:rFonts w:ascii="Times New Roman" w:eastAsia="Times New Roman" w:hAnsi="Times New Roman" w:cs="Times New Roman"/>
+          <w:noProof/>
           <w:sz w:val="28"/>
           <w:szCs w:val="28"/>
           <w:lang w:eastAsia="uk-UA"/>
         </w:rPr>
         <w:drawing>
-          <wp:inline distT="0" distB="0" distL="0" distR="0" wp14:anchorId="7C5BB9CF" wp14:editId="7D7DF385">
+          <wp:inline distT="0" distB="0" distL="0" distR="0" wp14:anchorId="19D91B2E" wp14:editId="38F47460">
             <wp:extent cx="6120765" cy="2761615"/>
             <wp:effectExtent l="0" t="0" r="0" b="635"/>
             <wp:docPr id="47" name="Рисунок 47"/>
@@ -20518,7 +21260,7 @@
                     <pic:cNvPicPr/>
                   </pic:nvPicPr>
                   <pic:blipFill>
-                    <a:blip r:embed="rId49"/>
+                    <a:blip r:embed="rId60"/>
                     <a:stretch>
                       <a:fillRect/>
                     </a:stretch>
@@ -20552,12 +21294,13 @@
       <w:r>
         <w:rPr>
           <w:rFonts w:ascii="Times New Roman" w:eastAsia="Times New Roman" w:hAnsi="Times New Roman" w:cs="Times New Roman"/>
+          <w:noProof/>
           <w:sz w:val="28"/>
           <w:szCs w:val="28"/>
           <w:lang w:eastAsia="uk-UA"/>
         </w:rPr>
         <w:drawing>
-          <wp:inline distT="0" distB="0" distL="0" distR="0" wp14:anchorId="3BB12989" wp14:editId="3E9433B0">
+          <wp:inline distT="0" distB="0" distL="0" distR="0" wp14:anchorId="1521575A" wp14:editId="3B20CE52">
             <wp:extent cx="6120765" cy="3060700"/>
             <wp:effectExtent l="0" t="0" r="0" b="6350"/>
             <wp:docPr id="49" name="Рисунок 49"/>
@@ -20572,7 +21315,7 @@
                     <pic:cNvPicPr/>
                   </pic:nvPicPr>
                   <pic:blipFill>
-                    <a:blip r:embed="rId50"/>
+                    <a:blip r:embed="rId61"/>
                     <a:stretch>
                       <a:fillRect/>
                     </a:stretch>
@@ -20606,13 +21349,14 @@
       <w:r>
         <w:rPr>
           <w:rFonts w:ascii="Times New Roman" w:eastAsia="Times New Roman" w:hAnsi="Times New Roman" w:cs="Times New Roman"/>
+          <w:noProof/>
           <w:sz w:val="28"/>
           <w:szCs w:val="28"/>
           <w:lang w:eastAsia="uk-UA"/>
         </w:rPr>
         <w:lastRenderedPageBreak/>
         <w:drawing>
-          <wp:inline distT="0" distB="0" distL="0" distR="0" wp14:anchorId="21F1A304" wp14:editId="4FFCFCC3">
+          <wp:inline distT="0" distB="0" distL="0" distR="0" wp14:anchorId="7497E339" wp14:editId="01F4EDD5">
             <wp:extent cx="6120765" cy="2819400"/>
             <wp:effectExtent l="0" t="0" r="0" b="0"/>
             <wp:docPr id="48" name="Рисунок 48"/>
@@ -20627,7 +21371,7 @@
                     <pic:cNvPicPr/>
                   </pic:nvPicPr>
                   <pic:blipFill>
-                    <a:blip r:embed="rId51"/>
+                    <a:blip r:embed="rId62"/>
                     <a:stretch>
                       <a:fillRect/>
                     </a:stretch>
@@ -20753,7 +21497,7 @@
           <w:rFonts w:ascii="Times New Roman" w:eastAsia="Times New Roman" w:hAnsi="Times New Roman" w:cs="Times New Roman"/>
           <w:sz w:val="28"/>
           <w:szCs w:val="28"/>
-          <w:lang w:val="ru-RU" w:eastAsia="uk-UA"/>
+          <w:lang w:eastAsia="uk-UA"/>
         </w:rPr>
         <w:t xml:space="preserve">. </w:t>
       </w:r>
@@ -20784,8 +21528,6 @@
         </w:rPr>
         <w:t>, який уточнює особливі точки і відбирає лише інлаєри. Після цього перевірив свій повний алгоритм на декількох зображеннях і переконався, що все працює добре.</w:t>
       </w:r>
-      <w:bookmarkStart w:id="0" w:name="_GoBack"/>
-      <w:bookmarkEnd w:id="0"/>
     </w:p>
     <w:sectPr>
       <w:pgSz w:w="11906" w:h="16838"/>
@@ -20798,7 +21540,7 @@
 </file>
 
 <file path=word/numbering.xml><?xml version="1.0" encoding="utf-8"?>
-<w:numbering xmlns:wpc="http://schemas.microsoft.com/office/word/2010/wordprocessingCanvas" xmlns:cx="http://schemas.microsoft.com/office/drawing/2014/chartex" xmlns:mc="http://schemas.openxmlformats.org/markup-compatibility/2006" xmlns:o="urn:schemas-microsoft-com:office:office" xmlns:r="http://schemas.openxmlformats.org/officeDocument/2006/relationships" xmlns:m="http://schemas.openxmlformats.org/officeDocument/2006/math" xmlns:v="urn:schemas-microsoft-com:vml" xmlns:wp14="http://schemas.microsoft.com/office/word/2010/wordprocessingDrawing" xmlns:wp="http://schemas.openxmlformats.org/drawingml/2006/wordprocessingDrawing" xmlns:w10="urn:schemas-microsoft-com:office:word" xmlns:w="http://schemas.openxmlformats.org/wordprocessingml/2006/main" xmlns:w14="http://schemas.microsoft.com/office/word/2010/wordml" xmlns:w15="http://schemas.microsoft.com/office/word/2012/wordml" xmlns:w16se="http://schemas.microsoft.com/office/word/2015/wordml/symex" xmlns:wpg="http://schemas.microsoft.com/office/word/2010/wordprocessingGroup" xmlns:wpi="http://schemas.microsoft.com/office/word/2010/wordprocessingInk" xmlns:wne="http://schemas.microsoft.com/office/word/2006/wordml" xmlns:wps="http://schemas.microsoft.com/office/word/2010/wordprocessingShape" mc:Ignorable="w14 w15 w16se wp14">
+<w:numbering xmlns:wpc="http://schemas.microsoft.com/office/word/2010/wordprocessingCanvas" xmlns:cx="http://schemas.microsoft.com/office/drawing/2014/chartex" xmlns:cx1="http://schemas.microsoft.com/office/drawing/2015/9/8/chartex" xmlns:cx2="http://schemas.microsoft.com/office/drawing/2015/10/21/chartex" xmlns:cx3="http://schemas.microsoft.com/office/drawing/2016/5/9/chartex" xmlns:cx4="http://schemas.microsoft.com/office/drawing/2016/5/10/chartex" xmlns:cx5="http://schemas.microsoft.com/office/drawing/2016/5/11/chartex" xmlns:cx6="http://schemas.microsoft.com/office/drawing/2016/5/12/chartex" xmlns:cx7="http://schemas.microsoft.com/office/drawing/2016/5/13/chartex" xmlns:cx8="http://schemas.microsoft.com/office/drawing/2016/5/14/chartex" xmlns:mc="http://schemas.openxmlformats.org/markup-compatibility/2006" xmlns:aink="http://schemas.microsoft.com/office/drawing/2016/ink" xmlns:am3d="http://schemas.microsoft.com/office/drawing/2017/model3d" xmlns:o="urn:schemas-microsoft-com:office:office" xmlns:oel="http://schemas.microsoft.com/office/2019/extlst" xmlns:r="http://schemas.openxmlformats.org/officeDocument/2006/relationships" xmlns:m="http://schemas.openxmlformats.org/officeDocument/2006/math" xmlns:v="urn:schemas-microsoft-com:vml" xmlns:wp14="http://schemas.microsoft.com/office/word/2010/wordprocessingDrawing" xmlns:wp="http://schemas.openxmlformats.org/drawingml/2006/wordprocessingDrawing" xmlns:w10="urn:schemas-microsoft-com:office:word" xmlns:w="http://schemas.openxmlformats.org/wordprocessingml/2006/main" xmlns:w14="http://schemas.microsoft.com/office/word/2010/wordml" xmlns:w15="http://schemas.microsoft.com/office/word/2012/wordml" xmlns:w16cex="http://schemas.microsoft.com/office/word/2018/wordml/cex" xmlns:w16cid="http://schemas.microsoft.com/office/word/2016/wordml/cid" xmlns:w16="http://schemas.microsoft.com/office/word/2018/wordml" xmlns:w16du="http://schemas.microsoft.com/office/word/2023/wordml/word16du" xmlns:w16sdtdh="http://schemas.microsoft.com/office/word/2020/wordml/sdtdatahash" xmlns:w16sdtfl="http://schemas.microsoft.com/office/word/2024/wordml/sdtformatlock" xmlns:w16se="http://schemas.microsoft.com/office/word/2015/wordml/symex" xmlns:wpg="http://schemas.microsoft.com/office/word/2010/wordprocessingGroup" xmlns:wpi="http://schemas.microsoft.com/office/word/2010/wordprocessingInk" xmlns:wne="http://schemas.microsoft.com/office/word/2006/wordml" xmlns:wps="http://schemas.microsoft.com/office/word/2010/wordprocessingShape" mc:Ignorable="w14 w15 w16se w16cid w16 w16cex w16sdtdh w16sdtfl w16du wp14">
   <w:abstractNum w:abstractNumId="0" w15:restartNumberingAfterBreak="0">
     <w:nsid w:val="018F6E30"/>
     <w:multiLevelType w:val="multilevel"/>
@@ -22013,41 +22755,41 @@
       </w:pPr>
     </w:lvl>
   </w:abstractNum>
-  <w:num w:numId="1">
+  <w:num w:numId="1" w16cid:durableId="1297644091">
     <w:abstractNumId w:val="5"/>
   </w:num>
-  <w:num w:numId="2">
+  <w:num w:numId="2" w16cid:durableId="449664888">
     <w:abstractNumId w:val="4"/>
   </w:num>
-  <w:num w:numId="3">
+  <w:num w:numId="3" w16cid:durableId="2079132606">
     <w:abstractNumId w:val="9"/>
   </w:num>
-  <w:num w:numId="4">
+  <w:num w:numId="4" w16cid:durableId="1164315639">
     <w:abstractNumId w:val="2"/>
   </w:num>
-  <w:num w:numId="5">
+  <w:num w:numId="5" w16cid:durableId="12806408">
     <w:abstractNumId w:val="1"/>
   </w:num>
-  <w:num w:numId="6">
+  <w:num w:numId="6" w16cid:durableId="536697050">
     <w:abstractNumId w:val="3"/>
   </w:num>
-  <w:num w:numId="7">
+  <w:num w:numId="7" w16cid:durableId="938177437">
     <w:abstractNumId w:val="6"/>
   </w:num>
-  <w:num w:numId="8">
+  <w:num w:numId="8" w16cid:durableId="1362710476">
     <w:abstractNumId w:val="0"/>
   </w:num>
-  <w:num w:numId="9">
+  <w:num w:numId="9" w16cid:durableId="1006977280">
     <w:abstractNumId w:val="7"/>
   </w:num>
-  <w:num w:numId="10">
+  <w:num w:numId="10" w16cid:durableId="615060555">
     <w:abstractNumId w:val="8"/>
   </w:num>
 </w:numbering>
 </file>
 
 <file path=word/styles.xml><?xml version="1.0" encoding="utf-8"?>
-<w:styles xmlns:mc="http://schemas.openxmlformats.org/markup-compatibility/2006" xmlns:r="http://schemas.openxmlformats.org/officeDocument/2006/relationships" xmlns:w="http://schemas.openxmlformats.org/wordprocessingml/2006/main" xmlns:w14="http://schemas.microsoft.com/office/word/2010/wordml" xmlns:w15="http://schemas.microsoft.com/office/word/2012/wordml" xmlns:w16se="http://schemas.microsoft.com/office/word/2015/wordml/symex" mc:Ignorable="w14 w15 w16se">
+<w:styles xmlns:mc="http://schemas.openxmlformats.org/markup-compatibility/2006" xmlns:r="http://schemas.openxmlformats.org/officeDocument/2006/relationships" xmlns:w="http://schemas.openxmlformats.org/wordprocessingml/2006/main" xmlns:w14="http://schemas.microsoft.com/office/word/2010/wordml" xmlns:w15="http://schemas.microsoft.com/office/word/2012/wordml" xmlns:w16cex="http://schemas.microsoft.com/office/word/2018/wordml/cex" xmlns:w16cid="http://schemas.microsoft.com/office/word/2016/wordml/cid" xmlns:w16="http://schemas.microsoft.com/office/word/2018/wordml" xmlns:w16du="http://schemas.microsoft.com/office/word/2023/wordml/word16du" xmlns:w16sdtdh="http://schemas.microsoft.com/office/word/2020/wordml/sdtdatahash" xmlns:w16sdtfl="http://schemas.microsoft.com/office/word/2024/wordml/sdtformatlock" xmlns:w16se="http://schemas.microsoft.com/office/word/2015/wordml/symex" mc:Ignorable="w14 w15 w16se w16cid w16 w16cex w16sdtdh w16sdtfl w16du">
   <w:docDefaults>
     <w:rPrDefault>
       <w:rPr>
@@ -22063,7 +22805,7 @@
       </w:pPr>
     </w:pPrDefault>
   </w:docDefaults>
-  <w:latentStyles w:defLockedState="0" w:defUIPriority="99" w:defSemiHidden="0" w:defUnhideWhenUsed="0" w:defQFormat="0" w:count="371">
+  <w:latentStyles w:defLockedState="0" w:defUIPriority="99" w:defSemiHidden="0" w:defUnhideWhenUsed="0" w:defQFormat="0" w:count="376">
     <w:lsdException w:name="Normal" w:uiPriority="0" w:qFormat="1"/>
     <w:lsdException w:name="heading 1" w:uiPriority="9" w:qFormat="1"/>
     <w:lsdException w:name="heading 2" w:semiHidden="1" w:uiPriority="9" w:unhideWhenUsed="1" w:qFormat="1"/>
@@ -22435,17 +23177,22 @@
     <w:lsdException w:name="List Table 5 Dark Accent 6" w:uiPriority="50"/>
     <w:lsdException w:name="List Table 6 Colorful Accent 6" w:uiPriority="51"/>
     <w:lsdException w:name="List Table 7 Colorful Accent 6" w:uiPriority="52"/>
+    <w:lsdException w:name="Mention" w:semiHidden="1" w:unhideWhenUsed="1"/>
+    <w:lsdException w:name="Smart Hyperlink" w:semiHidden="1" w:unhideWhenUsed="1"/>
+    <w:lsdException w:name="Hashtag" w:semiHidden="1" w:unhideWhenUsed="1"/>
+    <w:lsdException w:name="Unresolved Mention" w:semiHidden="1" w:unhideWhenUsed="1"/>
+    <w:lsdException w:name="Smart Link" w:semiHidden="1" w:unhideWhenUsed="1"/>
   </w:latentStyles>
-  <w:style w:type="paragraph" w:default="1" w:styleId="a">
+  <w:style w:type="paragraph" w:default="1" w:styleId="Normal">
     <w:name w:val="Normal"/>
     <w:qFormat/>
     <w:rsid w:val="00BE017E"/>
   </w:style>
-  <w:style w:type="paragraph" w:styleId="2">
+  <w:style w:type="paragraph" w:styleId="Heading2">
     <w:name w:val="heading 2"/>
-    <w:basedOn w:val="a"/>
-    <w:next w:val="a"/>
-    <w:link w:val="20"/>
+    <w:basedOn w:val="Normal"/>
+    <w:next w:val="Normal"/>
+    <w:link w:val="Heading2Char"/>
     <w:uiPriority w:val="9"/>
     <w:semiHidden/>
     <w:unhideWhenUsed/>
@@ -22464,10 +23211,10 @@
       <w:szCs w:val="26"/>
     </w:rPr>
   </w:style>
-  <w:style w:type="paragraph" w:styleId="3">
+  <w:style w:type="paragraph" w:styleId="Heading3">
     <w:name w:val="heading 3"/>
-    <w:basedOn w:val="a"/>
-    <w:link w:val="30"/>
+    <w:basedOn w:val="Normal"/>
+    <w:link w:val="Heading3Char"/>
     <w:uiPriority w:val="9"/>
     <w:qFormat/>
     <w:rsid w:val="00977560"/>
@@ -22484,13 +23231,12 @@
       <w:lang w:eastAsia="uk-UA"/>
     </w:rPr>
   </w:style>
-  <w:style w:type="character" w:default="1" w:styleId="a0">
+  <w:style w:type="character" w:default="1" w:styleId="DefaultParagraphFont">
     <w:name w:val="Default Paragraph Font"/>
     <w:uiPriority w:val="1"/>
-    <w:semiHidden/>
     <w:unhideWhenUsed/>
   </w:style>
-  <w:style w:type="table" w:default="1" w:styleId="a1">
+  <w:style w:type="table" w:default="1" w:styleId="TableNormal">
     <w:name w:val="Normal Table"/>
     <w:uiPriority w:val="99"/>
     <w:semiHidden/>
@@ -22505,13 +23251,13 @@
       </w:tblCellMar>
     </w:tblPr>
   </w:style>
-  <w:style w:type="numbering" w:default="1" w:styleId="a2">
+  <w:style w:type="numbering" w:default="1" w:styleId="NoList">
     <w:name w:val="No List"/>
     <w:uiPriority w:val="99"/>
     <w:semiHidden/>
     <w:unhideWhenUsed/>
   </w:style>
-  <w:style w:type="paragraph" w:styleId="a3">
+  <w:style w:type="paragraph" w:styleId="NoSpacing">
     <w:name w:val="No Spacing"/>
     <w:uiPriority w:val="1"/>
     <w:qFormat/>
@@ -22520,10 +23266,10 @@
       <w:spacing w:after="0" w:line="240" w:lineRule="auto"/>
     </w:pPr>
   </w:style>
-  <w:style w:type="paragraph" w:styleId="HTML">
+  <w:style w:type="paragraph" w:styleId="HTMLPreformatted">
     <w:name w:val="HTML Preformatted"/>
-    <w:basedOn w:val="a"/>
-    <w:link w:val="HTML0"/>
+    <w:basedOn w:val="Normal"/>
+    <w:link w:val="HTMLPreformattedChar"/>
     <w:uiPriority w:val="99"/>
     <w:semiHidden/>
     <w:unhideWhenUsed/>
@@ -22556,10 +23302,10 @@
       <w:lang w:eastAsia="uk-UA"/>
     </w:rPr>
   </w:style>
-  <w:style w:type="character" w:customStyle="1" w:styleId="HTML0">
-    <w:name w:val="Стандартный HTML Знак"/>
-    <w:basedOn w:val="a0"/>
-    <w:link w:val="HTML"/>
+  <w:style w:type="character" w:customStyle="1" w:styleId="HTMLPreformattedChar">
+    <w:name w:val="HTML Preformatted Char"/>
+    <w:basedOn w:val="DefaultParagraphFont"/>
+    <w:link w:val="HTMLPreformatted"/>
     <w:uiPriority w:val="99"/>
     <w:semiHidden/>
     <w:rsid w:val="004956B3"/>
@@ -22570,9 +23316,9 @@
       <w:lang w:eastAsia="uk-UA"/>
     </w:rPr>
   </w:style>
-  <w:style w:type="character" w:styleId="a4">
+  <w:style w:type="character" w:styleId="PlaceholderText">
     <w:name w:val="Placeholder Text"/>
-    <w:basedOn w:val="a0"/>
+    <w:basedOn w:val="DefaultParagraphFont"/>
     <w:uiPriority w:val="99"/>
     <w:semiHidden/>
     <w:rsid w:val="00D14FA5"/>
@@ -22582,12 +23328,12 @@
   </w:style>
   <w:style w:type="character" w:customStyle="1" w:styleId="math-inline">
     <w:name w:val="math-inline"/>
-    <w:basedOn w:val="a0"/>
+    <w:basedOn w:val="DefaultParagraphFont"/>
     <w:rsid w:val="00D14FA5"/>
   </w:style>
-  <w:style w:type="paragraph" w:styleId="a5">
+  <w:style w:type="paragraph" w:styleId="NormalWeb">
     <w:name w:val="Normal (Web)"/>
-    <w:basedOn w:val="a"/>
+    <w:basedOn w:val="Normal"/>
     <w:uiPriority w:val="99"/>
     <w:unhideWhenUsed/>
     <w:rsid w:val="00315F4A"/>
@@ -22601,9 +23347,9 @@
       <w:lang w:eastAsia="uk-UA"/>
     </w:rPr>
   </w:style>
-  <w:style w:type="character" w:styleId="HTML1">
+  <w:style w:type="character" w:styleId="HTMLCode">
     <w:name w:val="HTML Code"/>
-    <w:basedOn w:val="a0"/>
+    <w:basedOn w:val="DefaultParagraphFont"/>
     <w:uiPriority w:val="99"/>
     <w:semiHidden/>
     <w:unhideWhenUsed/>
@@ -22616,43 +23362,43 @@
   </w:style>
   <w:style w:type="character" w:customStyle="1" w:styleId="mord">
     <w:name w:val="mord"/>
-    <w:basedOn w:val="a0"/>
+    <w:basedOn w:val="DefaultParagraphFont"/>
     <w:rsid w:val="00315F4A"/>
   </w:style>
   <w:style w:type="character" w:customStyle="1" w:styleId="mopen">
     <w:name w:val="mopen"/>
-    <w:basedOn w:val="a0"/>
+    <w:basedOn w:val="DefaultParagraphFont"/>
     <w:rsid w:val="00315F4A"/>
   </w:style>
   <w:style w:type="character" w:customStyle="1" w:styleId="mpunct">
     <w:name w:val="mpunct"/>
-    <w:basedOn w:val="a0"/>
+    <w:basedOn w:val="DefaultParagraphFont"/>
     <w:rsid w:val="00315F4A"/>
   </w:style>
   <w:style w:type="character" w:customStyle="1" w:styleId="mclose">
     <w:name w:val="mclose"/>
-    <w:basedOn w:val="a0"/>
+    <w:basedOn w:val="DefaultParagraphFont"/>
     <w:rsid w:val="00315F4A"/>
   </w:style>
   <w:style w:type="character" w:customStyle="1" w:styleId="mrel">
     <w:name w:val="mrel"/>
-    <w:basedOn w:val="a0"/>
+    <w:basedOn w:val="DefaultParagraphFont"/>
     <w:rsid w:val="00315F4A"/>
   </w:style>
   <w:style w:type="character" w:customStyle="1" w:styleId="mbin">
     <w:name w:val="mbin"/>
-    <w:basedOn w:val="a0"/>
+    <w:basedOn w:val="DefaultParagraphFont"/>
     <w:rsid w:val="00315F4A"/>
   </w:style>
   <w:style w:type="character" w:customStyle="1" w:styleId="mop">
     <w:name w:val="mop"/>
-    <w:basedOn w:val="a0"/>
+    <w:basedOn w:val="DefaultParagraphFont"/>
     <w:rsid w:val="00315F4A"/>
   </w:style>
-  <w:style w:type="character" w:customStyle="1" w:styleId="30">
-    <w:name w:val="Заголовок 3 Знак"/>
-    <w:basedOn w:val="a0"/>
-    <w:link w:val="3"/>
+  <w:style w:type="character" w:customStyle="1" w:styleId="Heading3Char">
+    <w:name w:val="Heading 3 Char"/>
+    <w:basedOn w:val="DefaultParagraphFont"/>
+    <w:link w:val="Heading3"/>
     <w:uiPriority w:val="9"/>
     <w:rsid w:val="00977560"/>
     <w:rPr>
@@ -22664,9 +23410,9 @@
       <w:lang w:eastAsia="uk-UA"/>
     </w:rPr>
   </w:style>
-  <w:style w:type="paragraph" w:styleId="a6">
+  <w:style w:type="paragraph" w:styleId="ListParagraph">
     <w:name w:val="List Paragraph"/>
-    <w:basedOn w:val="a"/>
+    <w:basedOn w:val="Normal"/>
     <w:uiPriority w:val="34"/>
     <w:qFormat/>
     <w:rsid w:val="00556C16"/>
@@ -22675,10 +23421,10 @@
       <w:contextualSpacing/>
     </w:pPr>
   </w:style>
-  <w:style w:type="character" w:customStyle="1" w:styleId="20">
-    <w:name w:val="Заголовок 2 Знак"/>
-    <w:basedOn w:val="a0"/>
-    <w:link w:val="2"/>
+  <w:style w:type="character" w:customStyle="1" w:styleId="Heading2Char">
+    <w:name w:val="Heading 2 Char"/>
+    <w:basedOn w:val="DefaultParagraphFont"/>
+    <w:link w:val="Heading2"/>
     <w:uiPriority w:val="9"/>
     <w:semiHidden/>
     <w:rsid w:val="00556C16"/>

</xml_diff>